<commit_message>
add 2 and 3 lab of fedorov
</commit_message>
<xml_diff>
--- a/4 курс/Звуковое оборудование и аппаратно-программные средства медиаиндустрии/Лаба 6.docx
+++ b/4 курс/Звуковое оборудование и аппаратно-программные средства медиаиндустрии/Лаба 6.docx
@@ -503,6 +503,13 @@
     </w:p>
     <w:sdt>
       <w:sdtPr>
+        <w:rPr>
+          <w:rFonts w:ascii="Times New Roman" w:eastAsia="Times New Roman" w:hAnsi="Times New Roman" w:cs="Times New Roman"/>
+          <w:color w:val="auto"/>
+          <w:sz w:val="22"/>
+          <w:szCs w:val="22"/>
+          <w:lang w:eastAsia="en-US"/>
+        </w:rPr>
         <w:id w:val="131300304"/>
         <w:docPartObj>
           <w:docPartGallery w:val="Table of Contents"/>
@@ -511,33 +518,57 @@
       </w:sdtPr>
       <w:sdtEndPr>
         <w:rPr>
-          <w:rFonts w:ascii="Times New Roman" w:eastAsia="Times New Roman" w:hAnsi="Times New Roman" w:cs="Times New Roman"/>
           <w:b/>
           <w:bCs/>
-          <w:color w:val="auto"/>
-          <w:sz w:val="22"/>
-          <w:szCs w:val="22"/>
-          <w:lang w:eastAsia="en-US"/>
         </w:rPr>
       </w:sdtEndPr>
       <w:sdtContent>
         <w:p>
           <w:pPr>
             <w:pStyle w:val="ad"/>
+            <w:spacing w:line="360" w:lineRule="auto"/>
+            <w:jc w:val="center"/>
             <w:rPr>
-              <w:rFonts w:ascii="Times New Roman" w:hAnsi="Times New Roman" w:cs="Times New Roman"/>
+              <w:rStyle w:val="af5"/>
               <w:color w:val="auto"/>
+              <w:sz w:val="32"/>
+              <w:szCs w:val="32"/>
             </w:rPr>
           </w:pPr>
           <w:r>
             <w:rPr>
-              <w:rFonts w:ascii="Times New Roman" w:hAnsi="Times New Roman" w:cs="Times New Roman"/>
+              <w:rStyle w:val="af5"/>
               <w:color w:val="auto"/>
+              <w:sz w:val="32"/>
+              <w:szCs w:val="32"/>
             </w:rPr>
             <w:t>Оглавление</w:t>
           </w:r>
         </w:p>
         <w:p>
+          <w:pPr>
+            <w:rPr>
+              <w:lang w:eastAsia="ru-RU"/>
+            </w:rPr>
+          </w:pPr>
+        </w:p>
+        <w:p>
+          <w:pPr>
+            <w:pStyle w:val="10"/>
+            <w:tabs>
+              <w:tab w:val="right" w:leader="dot" w:pos="9345"/>
+            </w:tabs>
+            <w:spacing w:line="360" w:lineRule="auto"/>
+            <w:rPr>
+              <w:rFonts w:asciiTheme="minorHAnsi" w:eastAsiaTheme="minorEastAsia" w:hAnsiTheme="minorHAnsi" w:cstheme="minorBidi"/>
+              <w:noProof/>
+              <w:kern w:val="2"/>
+              <w:sz w:val="32"/>
+              <w:szCs w:val="32"/>
+              <w:lang w:eastAsia="ru-RU"/>
+              <w14:ligatures w14:val="standardContextual"/>
+            </w:rPr>
+          </w:pPr>
           <w:r>
             <w:rPr>
               <w:sz w:val="28"/>
@@ -559,16 +590,536 @@
             </w:rPr>
             <w:fldChar w:fldCharType="separate"/>
           </w:r>
-          <w:r>
+          <w:hyperlink w:anchor="_Toc219186184" w:history="1">
+            <w:r>
+              <w:rPr>
+                <w:rStyle w:val="ae"/>
+                <w:noProof/>
+                <w:sz w:val="28"/>
+                <w:szCs w:val="28"/>
+              </w:rPr>
+              <w:t>1 Подготовка к выполнению лабораторной работы</w:t>
+            </w:r>
+            <w:r>
+              <w:rPr>
+                <w:noProof/>
+                <w:webHidden/>
+                <w:sz w:val="28"/>
+                <w:szCs w:val="28"/>
+              </w:rPr>
+              <w:tab/>
+            </w:r>
+            <w:r>
+              <w:rPr>
+                <w:noProof/>
+                <w:webHidden/>
+                <w:sz w:val="28"/>
+                <w:szCs w:val="28"/>
+              </w:rPr>
+              <w:fldChar w:fldCharType="begin"/>
+            </w:r>
+            <w:r>
+              <w:rPr>
+                <w:noProof/>
+                <w:webHidden/>
+                <w:sz w:val="28"/>
+                <w:szCs w:val="28"/>
+              </w:rPr>
+              <w:instrText xml:space="preserve"> PAGEREF _Toc219186184 \h </w:instrText>
+            </w:r>
+            <w:r>
+              <w:rPr>
+                <w:noProof/>
+                <w:webHidden/>
+                <w:sz w:val="28"/>
+                <w:szCs w:val="28"/>
+              </w:rPr>
+            </w:r>
+            <w:r>
+              <w:rPr>
+                <w:noProof/>
+                <w:webHidden/>
+                <w:sz w:val="28"/>
+                <w:szCs w:val="28"/>
+              </w:rPr>
+              <w:fldChar w:fldCharType="separate"/>
+            </w:r>
+            <w:r>
+              <w:rPr>
+                <w:noProof/>
+                <w:webHidden/>
+                <w:sz w:val="28"/>
+                <w:szCs w:val="28"/>
+              </w:rPr>
+              <w:t>3</w:t>
+            </w:r>
+            <w:r>
+              <w:rPr>
+                <w:noProof/>
+                <w:webHidden/>
+                <w:sz w:val="28"/>
+                <w:szCs w:val="28"/>
+              </w:rPr>
+              <w:fldChar w:fldCharType="end"/>
+            </w:r>
+          </w:hyperlink>
+        </w:p>
+        <w:p>
+          <w:pPr>
+            <w:pStyle w:val="10"/>
+            <w:tabs>
+              <w:tab w:val="right" w:leader="dot" w:pos="9345"/>
+            </w:tabs>
+            <w:spacing w:line="360" w:lineRule="auto"/>
             <w:rPr>
-              <w:b/>
-              <w:bCs/>
+              <w:rFonts w:asciiTheme="minorHAnsi" w:eastAsiaTheme="minorEastAsia" w:hAnsiTheme="minorHAnsi" w:cstheme="minorBidi"/>
               <w:noProof/>
-              <w:sz w:val="28"/>
-              <w:szCs w:val="28"/>
+              <w:kern w:val="2"/>
+              <w:sz w:val="32"/>
+              <w:szCs w:val="32"/>
+              <w:lang w:eastAsia="ru-RU"/>
+              <w14:ligatures w14:val="standardContextual"/>
             </w:rPr>
-            <w:t>Элементы оглавления не найдены.</w:t>
-          </w:r>
+          </w:pPr>
+          <w:hyperlink w:anchor="_Toc219186185" w:history="1">
+            <w:r>
+              <w:rPr>
+                <w:rStyle w:val="ae"/>
+                <w:noProof/>
+                <w:sz w:val="28"/>
+                <w:szCs w:val="28"/>
+              </w:rPr>
+              <w:t>2 Измерение акустических параметров помещения</w:t>
+            </w:r>
+            <w:r>
+              <w:rPr>
+                <w:noProof/>
+                <w:webHidden/>
+                <w:sz w:val="28"/>
+                <w:szCs w:val="28"/>
+              </w:rPr>
+              <w:tab/>
+            </w:r>
+            <w:r>
+              <w:rPr>
+                <w:noProof/>
+                <w:webHidden/>
+                <w:sz w:val="28"/>
+                <w:szCs w:val="28"/>
+              </w:rPr>
+              <w:fldChar w:fldCharType="begin"/>
+            </w:r>
+            <w:r>
+              <w:rPr>
+                <w:noProof/>
+                <w:webHidden/>
+                <w:sz w:val="28"/>
+                <w:szCs w:val="28"/>
+              </w:rPr>
+              <w:instrText xml:space="preserve"> PAGEREF _Toc219186185 \h </w:instrText>
+            </w:r>
+            <w:r>
+              <w:rPr>
+                <w:noProof/>
+                <w:webHidden/>
+                <w:sz w:val="28"/>
+                <w:szCs w:val="28"/>
+              </w:rPr>
+            </w:r>
+            <w:r>
+              <w:rPr>
+                <w:noProof/>
+                <w:webHidden/>
+                <w:sz w:val="28"/>
+                <w:szCs w:val="28"/>
+              </w:rPr>
+              <w:fldChar w:fldCharType="separate"/>
+            </w:r>
+            <w:r>
+              <w:rPr>
+                <w:noProof/>
+                <w:webHidden/>
+                <w:sz w:val="28"/>
+                <w:szCs w:val="28"/>
+              </w:rPr>
+              <w:t>4</w:t>
+            </w:r>
+            <w:r>
+              <w:rPr>
+                <w:noProof/>
+                <w:webHidden/>
+                <w:sz w:val="28"/>
+                <w:szCs w:val="28"/>
+              </w:rPr>
+              <w:fldChar w:fldCharType="end"/>
+            </w:r>
+          </w:hyperlink>
+        </w:p>
+        <w:p>
+          <w:pPr>
+            <w:pStyle w:val="21"/>
+            <w:tabs>
+              <w:tab w:val="right" w:leader="dot" w:pos="9345"/>
+            </w:tabs>
+            <w:spacing w:line="360" w:lineRule="auto"/>
+            <w:rPr>
+              <w:rFonts w:asciiTheme="minorHAnsi" w:eastAsiaTheme="minorEastAsia" w:hAnsiTheme="minorHAnsi" w:cstheme="minorBidi"/>
+              <w:noProof/>
+              <w:kern w:val="2"/>
+              <w:sz w:val="32"/>
+              <w:szCs w:val="32"/>
+              <w:lang w:eastAsia="ru-RU"/>
+              <w14:ligatures w14:val="standardContextual"/>
+            </w:rPr>
+          </w:pPr>
+          <w:hyperlink w:anchor="_Toc219186186" w:history="1">
+            <w:r>
+              <w:rPr>
+                <w:rStyle w:val="ae"/>
+                <w:noProof/>
+                <w:sz w:val="28"/>
+                <w:szCs w:val="28"/>
+              </w:rPr>
+              <w:t>2.1 Расчет кривых спада</w:t>
+            </w:r>
+            <w:r>
+              <w:rPr>
+                <w:noProof/>
+                <w:webHidden/>
+                <w:sz w:val="28"/>
+                <w:szCs w:val="28"/>
+              </w:rPr>
+              <w:tab/>
+            </w:r>
+            <w:r>
+              <w:rPr>
+                <w:noProof/>
+                <w:webHidden/>
+                <w:sz w:val="28"/>
+                <w:szCs w:val="28"/>
+              </w:rPr>
+              <w:fldChar w:fldCharType="begin"/>
+            </w:r>
+            <w:r>
+              <w:rPr>
+                <w:noProof/>
+                <w:webHidden/>
+                <w:sz w:val="28"/>
+                <w:szCs w:val="28"/>
+              </w:rPr>
+              <w:instrText xml:space="preserve"> PAGEREF _Toc219186186 \h </w:instrText>
+            </w:r>
+            <w:r>
+              <w:rPr>
+                <w:noProof/>
+                <w:webHidden/>
+                <w:sz w:val="28"/>
+                <w:szCs w:val="28"/>
+              </w:rPr>
+            </w:r>
+            <w:r>
+              <w:rPr>
+                <w:noProof/>
+                <w:webHidden/>
+                <w:sz w:val="28"/>
+                <w:szCs w:val="28"/>
+              </w:rPr>
+              <w:fldChar w:fldCharType="separate"/>
+            </w:r>
+            <w:r>
+              <w:rPr>
+                <w:noProof/>
+                <w:webHidden/>
+                <w:sz w:val="28"/>
+                <w:szCs w:val="28"/>
+              </w:rPr>
+              <w:t>4</w:t>
+            </w:r>
+            <w:r>
+              <w:rPr>
+                <w:noProof/>
+                <w:webHidden/>
+                <w:sz w:val="28"/>
+                <w:szCs w:val="28"/>
+              </w:rPr>
+              <w:fldChar w:fldCharType="end"/>
+            </w:r>
+          </w:hyperlink>
+        </w:p>
+        <w:p>
+          <w:pPr>
+            <w:pStyle w:val="21"/>
+            <w:tabs>
+              <w:tab w:val="right" w:leader="dot" w:pos="9345"/>
+            </w:tabs>
+            <w:spacing w:line="360" w:lineRule="auto"/>
+            <w:rPr>
+              <w:rFonts w:asciiTheme="minorHAnsi" w:eastAsiaTheme="minorEastAsia" w:hAnsiTheme="minorHAnsi" w:cstheme="minorBidi"/>
+              <w:noProof/>
+              <w:kern w:val="2"/>
+              <w:sz w:val="32"/>
+              <w:szCs w:val="32"/>
+              <w:lang w:eastAsia="ru-RU"/>
+              <w14:ligatures w14:val="standardContextual"/>
+            </w:rPr>
+          </w:pPr>
+          <w:hyperlink w:anchor="_Toc219186187" w:history="1">
+            <w:r>
+              <w:rPr>
+                <w:rStyle w:val="ae"/>
+                <w:noProof/>
+                <w:sz w:val="28"/>
+                <w:szCs w:val="28"/>
+              </w:rPr>
+              <w:t>2.2 Расчет акустических параметров помещения</w:t>
+            </w:r>
+            <w:r>
+              <w:rPr>
+                <w:noProof/>
+                <w:webHidden/>
+                <w:sz w:val="28"/>
+                <w:szCs w:val="28"/>
+              </w:rPr>
+              <w:tab/>
+            </w:r>
+            <w:r>
+              <w:rPr>
+                <w:noProof/>
+                <w:webHidden/>
+                <w:sz w:val="28"/>
+                <w:szCs w:val="28"/>
+              </w:rPr>
+              <w:fldChar w:fldCharType="begin"/>
+            </w:r>
+            <w:r>
+              <w:rPr>
+                <w:noProof/>
+                <w:webHidden/>
+                <w:sz w:val="28"/>
+                <w:szCs w:val="28"/>
+              </w:rPr>
+              <w:instrText xml:space="preserve"> PAGEREF _Toc219186187 \h </w:instrText>
+            </w:r>
+            <w:r>
+              <w:rPr>
+                <w:noProof/>
+                <w:webHidden/>
+                <w:sz w:val="28"/>
+                <w:szCs w:val="28"/>
+              </w:rPr>
+            </w:r>
+            <w:r>
+              <w:rPr>
+                <w:noProof/>
+                <w:webHidden/>
+                <w:sz w:val="28"/>
+                <w:szCs w:val="28"/>
+              </w:rPr>
+              <w:fldChar w:fldCharType="separate"/>
+            </w:r>
+            <w:r>
+              <w:rPr>
+                <w:noProof/>
+                <w:webHidden/>
+                <w:sz w:val="28"/>
+                <w:szCs w:val="28"/>
+              </w:rPr>
+              <w:t>9</w:t>
+            </w:r>
+            <w:r>
+              <w:rPr>
+                <w:noProof/>
+                <w:webHidden/>
+                <w:sz w:val="28"/>
+                <w:szCs w:val="28"/>
+              </w:rPr>
+              <w:fldChar w:fldCharType="end"/>
+            </w:r>
+          </w:hyperlink>
+        </w:p>
+        <w:p>
+          <w:pPr>
+            <w:pStyle w:val="21"/>
+            <w:tabs>
+              <w:tab w:val="right" w:leader="dot" w:pos="9345"/>
+            </w:tabs>
+            <w:spacing w:line="360" w:lineRule="auto"/>
+            <w:rPr>
+              <w:rFonts w:asciiTheme="minorHAnsi" w:eastAsiaTheme="minorEastAsia" w:hAnsiTheme="minorHAnsi" w:cstheme="minorBidi"/>
+              <w:noProof/>
+              <w:kern w:val="2"/>
+              <w:sz w:val="32"/>
+              <w:szCs w:val="32"/>
+              <w:lang w:eastAsia="ru-RU"/>
+              <w14:ligatures w14:val="standardContextual"/>
+            </w:rPr>
+          </w:pPr>
+          <w:hyperlink w:anchor="_Toc219186188" w:history="1">
+            <w:r>
+              <w:rPr>
+                <w:rStyle w:val="ae"/>
+                <w:noProof/>
+                <w:sz w:val="28"/>
+                <w:szCs w:val="28"/>
+              </w:rPr>
+              <w:t>2.3 Пространственное усреднение результатов измерений</w:t>
+            </w:r>
+            <w:r>
+              <w:rPr>
+                <w:noProof/>
+                <w:webHidden/>
+                <w:sz w:val="28"/>
+                <w:szCs w:val="28"/>
+              </w:rPr>
+              <w:tab/>
+            </w:r>
+            <w:r>
+              <w:rPr>
+                <w:noProof/>
+                <w:webHidden/>
+                <w:sz w:val="28"/>
+                <w:szCs w:val="28"/>
+              </w:rPr>
+              <w:fldChar w:fldCharType="begin"/>
+            </w:r>
+            <w:r>
+              <w:rPr>
+                <w:noProof/>
+                <w:webHidden/>
+                <w:sz w:val="28"/>
+                <w:szCs w:val="28"/>
+              </w:rPr>
+              <w:instrText xml:space="preserve"> PAGEREF _Toc219186188 \h </w:instrText>
+            </w:r>
+            <w:r>
+              <w:rPr>
+                <w:noProof/>
+                <w:webHidden/>
+                <w:sz w:val="28"/>
+                <w:szCs w:val="28"/>
+              </w:rPr>
+            </w:r>
+            <w:r>
+              <w:rPr>
+                <w:noProof/>
+                <w:webHidden/>
+                <w:sz w:val="28"/>
+                <w:szCs w:val="28"/>
+              </w:rPr>
+              <w:fldChar w:fldCharType="separate"/>
+            </w:r>
+            <w:r>
+              <w:rPr>
+                <w:noProof/>
+                <w:webHidden/>
+                <w:sz w:val="28"/>
+                <w:szCs w:val="28"/>
+              </w:rPr>
+              <w:t>15</w:t>
+            </w:r>
+            <w:r>
+              <w:rPr>
+                <w:noProof/>
+                <w:webHidden/>
+                <w:sz w:val="28"/>
+                <w:szCs w:val="28"/>
+              </w:rPr>
+              <w:fldChar w:fldCharType="end"/>
+            </w:r>
+          </w:hyperlink>
+        </w:p>
+        <w:p>
+          <w:pPr>
+            <w:pStyle w:val="10"/>
+            <w:tabs>
+              <w:tab w:val="right" w:leader="dot" w:pos="9345"/>
+            </w:tabs>
+            <w:spacing w:line="360" w:lineRule="auto"/>
+            <w:rPr>
+              <w:rFonts w:asciiTheme="minorHAnsi" w:eastAsiaTheme="minorEastAsia" w:hAnsiTheme="minorHAnsi" w:cstheme="minorBidi"/>
+              <w:noProof/>
+              <w:kern w:val="2"/>
+              <w:sz w:val="32"/>
+              <w:szCs w:val="32"/>
+              <w:lang w:eastAsia="ru-RU"/>
+              <w14:ligatures w14:val="standardContextual"/>
+            </w:rPr>
+          </w:pPr>
+          <w:hyperlink w:anchor="_Toc219186189" w:history="1">
+            <w:r>
+              <w:rPr>
+                <w:rStyle w:val="ae"/>
+                <w:noProof/>
+                <w:sz w:val="28"/>
+                <w:szCs w:val="28"/>
+              </w:rPr>
+              <w:t>3 Анализ результатов измерений</w:t>
+            </w:r>
+            <w:r>
+              <w:rPr>
+                <w:noProof/>
+                <w:webHidden/>
+                <w:sz w:val="28"/>
+                <w:szCs w:val="28"/>
+              </w:rPr>
+              <w:tab/>
+            </w:r>
+            <w:r>
+              <w:rPr>
+                <w:noProof/>
+                <w:webHidden/>
+                <w:sz w:val="28"/>
+                <w:szCs w:val="28"/>
+              </w:rPr>
+              <w:fldChar w:fldCharType="begin"/>
+            </w:r>
+            <w:r>
+              <w:rPr>
+                <w:noProof/>
+                <w:webHidden/>
+                <w:sz w:val="28"/>
+                <w:szCs w:val="28"/>
+              </w:rPr>
+              <w:instrText xml:space="preserve"> PAGEREF _Toc219186189 \h </w:instrText>
+            </w:r>
+            <w:r>
+              <w:rPr>
+                <w:noProof/>
+                <w:webHidden/>
+                <w:sz w:val="28"/>
+                <w:szCs w:val="28"/>
+              </w:rPr>
+            </w:r>
+            <w:r>
+              <w:rPr>
+                <w:noProof/>
+                <w:webHidden/>
+                <w:sz w:val="28"/>
+                <w:szCs w:val="28"/>
+              </w:rPr>
+              <w:fldChar w:fldCharType="separate"/>
+            </w:r>
+            <w:r>
+              <w:rPr>
+                <w:noProof/>
+                <w:webHidden/>
+                <w:sz w:val="28"/>
+                <w:szCs w:val="28"/>
+              </w:rPr>
+              <w:t>17</w:t>
+            </w:r>
+            <w:r>
+              <w:rPr>
+                <w:noProof/>
+                <w:webHidden/>
+                <w:sz w:val="28"/>
+                <w:szCs w:val="28"/>
+              </w:rPr>
+              <w:fldChar w:fldCharType="end"/>
+            </w:r>
+          </w:hyperlink>
+        </w:p>
+        <w:p>
           <w:r>
             <w:rPr>
               <w:b/>
@@ -614,6 +1165,7 @@
         </w:rPr>
       </w:pPr>
       <w:bookmarkStart w:id="0" w:name="_Toc217333513"/>
+      <w:bookmarkStart w:id="1" w:name="_Toc219186184"/>
       <w:r>
         <w:rPr>
           <w:sz w:val="32"/>
@@ -623,6 +1175,7 @@
         <w:t>1 Подготовка к выполнению лабораторной работы</w:t>
       </w:r>
       <w:bookmarkEnd w:id="0"/>
+      <w:bookmarkEnd w:id="1"/>
     </w:p>
     <w:p>
       <w:pPr>
@@ -656,13 +1209,7 @@
         <w:pStyle w:val="af"/>
       </w:pPr>
       <w:r>
-        <w:t>Параметры исследуемого помещения указаны в табл</w:t>
-      </w:r>
-      <w:r>
-        <w:t xml:space="preserve">ице </w:t>
-      </w:r>
-      <w:r>
-        <w:t>1.</w:t>
+        <w:t>Параметры исследуемого помещения указаны в таблице 1.</w:t>
       </w:r>
     </w:p>
     <w:p>
@@ -1475,7 +2022,8 @@
           <w:szCs w:val="32"/>
         </w:rPr>
       </w:pPr>
-      <w:bookmarkStart w:id="1" w:name="_Toc217333514"/>
+      <w:bookmarkStart w:id="2" w:name="_Toc217333514"/>
+      <w:bookmarkStart w:id="3" w:name="_Toc219186185"/>
       <w:r>
         <w:rPr>
           <w:sz w:val="32"/>
@@ -1484,7 +2032,8 @@
         <w:lastRenderedPageBreak/>
         <w:t>2 Измерение акустических параметров помещения</w:t>
       </w:r>
-      <w:bookmarkEnd w:id="1"/>
+      <w:bookmarkEnd w:id="2"/>
+      <w:bookmarkEnd w:id="3"/>
     </w:p>
     <w:p>
       <w:pPr>
@@ -1508,15 +2057,24 @@
           <w:szCs w:val="32"/>
         </w:rPr>
       </w:pPr>
-      <w:bookmarkStart w:id="2" w:name="_Toc217333515"/>
+      <w:bookmarkStart w:id="4" w:name="_Toc217333515"/>
+      <w:bookmarkStart w:id="5" w:name="_Toc219186186"/>
       <w:r>
         <w:rPr>
           <w:sz w:val="32"/>
           <w:szCs w:val="32"/>
         </w:rPr>
+        <w:t xml:space="preserve">2.1 </w:t>
+      </w:r>
+      <w:r>
+        <w:rPr>
+          <w:sz w:val="32"/>
+          <w:szCs w:val="32"/>
+        </w:rPr>
         <w:t>Расчет кривых спада</w:t>
       </w:r>
-      <w:bookmarkEnd w:id="2"/>
+      <w:bookmarkEnd w:id="4"/>
+      <w:bookmarkEnd w:id="5"/>
     </w:p>
     <w:p>
       <w:pPr>
@@ -1534,162 +2092,143 @@
         <w:t>ем</w:t>
       </w:r>
       <w:r>
-        <w:t xml:space="preserve"> файл с расширением </w:t>
-      </w:r>
-      <w:proofErr w:type="gramStart"/>
-      <w:r>
-        <w:t>*.</w:t>
+        <w:t xml:space="preserve"> файл, содержащий результаты измерения импульсных переходных характеристик помещения по методу КЧ</w:t>
+      </w:r>
+      <w:r>
+        <w:t>.</w:t>
+      </w:r>
+    </w:p>
+    <w:p>
+      <w:pPr>
+        <w:pStyle w:val="af"/>
+      </w:pPr>
+      <w:r>
+        <w:t>В основном окне ПО REW выбер</w:t>
+      </w:r>
+      <w:r>
+        <w:t>ем</w:t>
+      </w:r>
+      <w:r>
+        <w:t xml:space="preserve"> карточку измерений, соответствующую позиции источника И1 и точке измерения М1 и откр</w:t>
+      </w:r>
+      <w:r>
+        <w:t>оем</w:t>
+      </w:r>
+      <w:r>
+        <w:t xml:space="preserve"> модуль расчета ИИПХ и кривой спада</w:t>
+      </w:r>
+      <w:r>
+        <w:t>.</w:t>
+      </w:r>
+    </w:p>
+    <w:p>
+      <w:pPr>
+        <w:pStyle w:val="af"/>
+      </w:pPr>
+      <w:r>
+        <w:t xml:space="preserve">Откроем настройки модуля </w:t>
       </w:r>
       <w:proofErr w:type="spellStart"/>
       <w:r>
-        <w:t>mdat</w:t>
+        <w:t>Filtered</w:t>
       </w:r>
       <w:proofErr w:type="spellEnd"/>
-      <w:proofErr w:type="gramEnd"/>
-      <w:r>
-        <w:t>, содержащий результаты измерения импульсных переходных характеристик помещения по методу КЧ</w:t>
-      </w:r>
-      <w:r>
-        <w:t>.</w:t>
-      </w:r>
-    </w:p>
-    <w:p>
-      <w:pPr>
-        <w:pStyle w:val="af"/>
-      </w:pPr>
-      <w:r>
-        <w:t>В основном окне ПО REW выбер</w:t>
-      </w:r>
-      <w:r>
-        <w:t>ем</w:t>
-      </w:r>
-      <w:r>
-        <w:t xml:space="preserve"> карточку измерений, соответствующую позиции источника И1 и точке измерения М1 и откр</w:t>
-      </w:r>
-      <w:r>
-        <w:t>оем</w:t>
-      </w:r>
-      <w:r>
-        <w:t xml:space="preserve"> модуль расчета ИИПХ и кривой спада</w:t>
-      </w:r>
-      <w:r>
-        <w:t>.</w:t>
-      </w:r>
-    </w:p>
-    <w:p>
-      <w:pPr>
-        <w:pStyle w:val="af"/>
-      </w:pPr>
-      <w:r>
-        <w:t xml:space="preserve">Откроем настройки модуля </w:t>
+      <w:r>
+        <w:t xml:space="preserve"> IR.</w:t>
+      </w:r>
+    </w:p>
+    <w:p>
+      <w:pPr>
+        <w:pStyle w:val="af"/>
+      </w:pPr>
+      <w:r>
+        <w:t>Включи</w:t>
+      </w:r>
+      <w:r>
+        <w:t>м</w:t>
+      </w:r>
+      <w:r>
+        <w:t xml:space="preserve"> опцию отображения линии регрессии</w:t>
+      </w:r>
+      <w:r>
+        <w:t xml:space="preserve"> (Show </w:t>
       </w:r>
       <w:proofErr w:type="spellStart"/>
       <w:r>
-        <w:t>Filtered</w:t>
+        <w:t>regression</w:t>
       </w:r>
       <w:proofErr w:type="spellEnd"/>
       <w:r>
-        <w:t xml:space="preserve"> IR.</w:t>
-      </w:r>
-    </w:p>
-    <w:p>
-      <w:pPr>
-        <w:pStyle w:val="af"/>
-      </w:pPr>
-      <w:r>
-        <w:t>Включи</w:t>
+        <w:t xml:space="preserve"> </w:t>
+      </w:r>
+      <w:proofErr w:type="spellStart"/>
+      <w:r>
+        <w:t>line</w:t>
+      </w:r>
+      <w:proofErr w:type="spellEnd"/>
+      <w:r>
+        <w:t>)</w:t>
+      </w:r>
+      <w:r>
+        <w:t xml:space="preserve"> на графике ИПХ.</w:t>
+      </w:r>
+    </w:p>
+    <w:p>
+      <w:pPr>
+        <w:pStyle w:val="af"/>
+      </w:pPr>
+      <w:r>
+        <w:t>Примени</w:t>
       </w:r>
       <w:r>
         <w:t>м</w:t>
       </w:r>
       <w:r>
-        <w:t xml:space="preserve"> опцию отображения линии регрессии</w:t>
+        <w:t xml:space="preserve"> временное сглаживание ИИПХ</w:t>
+      </w:r>
+      <w:r>
+        <w:t xml:space="preserve"> (</w:t>
+      </w:r>
+      <w:r>
+        <w:rPr>
+          <w:lang w:val="en-US"/>
+        </w:rPr>
+        <w:t>ETC</w:t>
       </w:r>
       <w:r>
         <w:t xml:space="preserve"> </w:t>
       </w:r>
       <w:r>
-        <w:t xml:space="preserve">(Show </w:t>
-      </w:r>
-      <w:proofErr w:type="spellStart"/>
-      <w:r>
-        <w:t>regression</w:t>
-      </w:r>
-      <w:proofErr w:type="spellEnd"/>
-      <w:r>
-        <w:t xml:space="preserve"> </w:t>
-      </w:r>
-      <w:proofErr w:type="spellStart"/>
-      <w:r>
-        <w:t>line</w:t>
-      </w:r>
-      <w:proofErr w:type="spellEnd"/>
+        <w:rPr>
+          <w:lang w:val="en-US"/>
+        </w:rPr>
+        <w:t>smoothing</w:t>
+      </w:r>
       <w:r>
         <w:t>)</w:t>
       </w:r>
       <w:r>
-        <w:t xml:space="preserve"> на графике ИПХ.</w:t>
-      </w:r>
-    </w:p>
-    <w:p>
-      <w:pPr>
-        <w:pStyle w:val="af"/>
-      </w:pPr>
-      <w:r>
-        <w:t>Примени</w:t>
+        <w:t xml:space="preserve"> на интервале 1 мс.</w:t>
+      </w:r>
+    </w:p>
+    <w:p>
+      <w:pPr>
+        <w:pStyle w:val="af"/>
+      </w:pPr>
+      <w:r>
+        <w:t xml:space="preserve">В </w:t>
+      </w:r>
+      <w:r>
+        <w:t>настройках модуля включи</w:t>
       </w:r>
       <w:r>
         <w:t>м</w:t>
       </w:r>
       <w:r>
-        <w:t xml:space="preserve"> временное сглаживание ИИПХ</w:t>
-      </w:r>
-      <w:r>
-        <w:t xml:space="preserve"> (</w:t>
-      </w:r>
-      <w:r>
-        <w:rPr>
-          <w:lang w:val="en-US"/>
-        </w:rPr>
-        <w:t>ETC</w:t>
-      </w:r>
-      <w:r>
-        <w:t xml:space="preserve"> </w:t>
-      </w:r>
-      <w:r>
-        <w:rPr>
-          <w:lang w:val="en-US"/>
-        </w:rPr>
-        <w:t>smoothing</w:t>
-      </w:r>
-      <w:r>
-        <w:t>)</w:t>
-      </w:r>
-      <w:r>
-        <w:t xml:space="preserve"> на интервале 1 мс.</w:t>
-      </w:r>
-    </w:p>
-    <w:p>
-      <w:pPr>
-        <w:pStyle w:val="af"/>
-      </w:pPr>
-      <w:r>
-        <w:t xml:space="preserve">В </w:t>
-      </w:r>
-      <w:r>
-        <w:t>настройках модуля включи</w:t>
-      </w:r>
-      <w:r>
-        <w:t>м</w:t>
-      </w:r>
-      <w:r>
         <w:t xml:space="preserve"> панель отображения параметров, определяемых на основе ИПХ</w:t>
       </w:r>
       <w:r>
-        <w:t xml:space="preserve"> </w:t>
-      </w:r>
-      <w:r>
-        <w:t xml:space="preserve">(опция Show </w:t>
+        <w:t xml:space="preserve"> (опция Show </w:t>
       </w:r>
       <w:proofErr w:type="spellStart"/>
       <w:r>
@@ -1845,6 +2384,9 @@
         <w:jc w:val="center"/>
       </w:pPr>
       <w:r>
+        <w:rPr>
+          <w:noProof/>
+        </w:rPr>
         <w:lastRenderedPageBreak/>
         <w:drawing>
           <wp:inline distT="0" distB="0" distL="0" distR="0" wp14:anchorId="34CEADBD" wp14:editId="71DF7FC3">
@@ -1927,6 +2469,9 @@
         <w:jc w:val="center"/>
       </w:pPr>
       <w:r>
+        <w:rPr>
+          <w:noProof/>
+        </w:rPr>
         <w:drawing>
           <wp:inline distT="0" distB="0" distL="0" distR="0" wp14:anchorId="1FD5CB58" wp14:editId="3883359C">
             <wp:extent cx="5940425" cy="3381375"/>
@@ -1970,46 +2515,41 @@
         <w:spacing w:line="360" w:lineRule="auto"/>
       </w:pPr>
       <w:r>
-        <w:t xml:space="preserve">Рисунок </w:t>
+        <w:t xml:space="preserve">Рисунок 2 – График ИПХ </w:t>
+      </w:r>
+      <w:r>
+        <w:rPr>
+          <w:lang w:val="en-US"/>
+        </w:rPr>
+        <w:t>S</w:t>
+      </w:r>
+      <w:r>
+        <w:t>01_</w:t>
+      </w:r>
+      <w:r>
+        <w:rPr>
+          <w:lang w:val="en-US"/>
+        </w:rPr>
+        <w:t>M</w:t>
+      </w:r>
+      <w:r>
+        <w:t>0</w:t>
       </w:r>
       <w:r>
         <w:t>2</w:t>
       </w:r>
-      <w:r>
-        <w:t xml:space="preserve"> – График ИПХ </w:t>
-      </w:r>
-      <w:r>
+    </w:p>
+    <w:p>
+      <w:pPr>
+        <w:pStyle w:val="af"/>
+        <w:ind w:firstLine="0"/>
         <w:rPr>
           <w:lang w:val="en-US"/>
         </w:rPr>
-        <w:t>S</w:t>
-      </w:r>
-      <w:r>
-        <w:t>01_</w:t>
-      </w:r>
-      <w:r>
-        <w:rPr>
-          <w:lang w:val="en-US"/>
-        </w:rPr>
-        <w:t>M</w:t>
-      </w:r>
-      <w:r>
-        <w:t>0</w:t>
-      </w:r>
-      <w:r>
-        <w:t>2</w:t>
-      </w:r>
-    </w:p>
-    <w:p>
-      <w:pPr>
-        <w:pStyle w:val="af"/>
-        <w:ind w:firstLine="0"/>
-        <w:rPr>
-          <w:lang w:val="en-US"/>
-        </w:rPr>
-      </w:pPr>
-      <w:r>
-        <w:rPr>
+      </w:pPr>
+      <w:r>
+        <w:rPr>
+          <w:noProof/>
           <w:lang w:val="en-US"/>
         </w:rPr>
         <w:lastRenderedPageBreak/>
@@ -2059,42 +2599,36 @@
         </w:rPr>
       </w:pPr>
       <w:r>
-        <w:t xml:space="preserve">Рисунок </w:t>
+        <w:t xml:space="preserve">Рисунок 3 – График ИПХ </w:t>
+      </w:r>
+      <w:r>
+        <w:rPr>
+          <w:lang w:val="en-US"/>
+        </w:rPr>
+        <w:t>S</w:t>
+      </w:r>
+      <w:r>
+        <w:t>01_</w:t>
+      </w:r>
+      <w:r>
+        <w:rPr>
+          <w:lang w:val="en-US"/>
+        </w:rPr>
+        <w:t>M</w:t>
+      </w:r>
+      <w:r>
+        <w:t>0</w:t>
       </w:r>
       <w:r>
         <w:t>3</w:t>
       </w:r>
-      <w:r>
-        <w:t xml:space="preserve"> – График ИПХ </w:t>
-      </w:r>
-      <w:r>
+    </w:p>
+    <w:p>
+      <w:pPr>
+        <w:spacing w:line="360" w:lineRule="auto"/>
         <w:rPr>
           <w:lang w:val="en-US"/>
         </w:rPr>
-        <w:t>S</w:t>
-      </w:r>
-      <w:r>
-        <w:t>01_</w:t>
-      </w:r>
-      <w:r>
-        <w:rPr>
-          <w:lang w:val="en-US"/>
-        </w:rPr>
-        <w:t>M</w:t>
-      </w:r>
-      <w:r>
-        <w:t>0</w:t>
-      </w:r>
-      <w:r>
-        <w:t>3</w:t>
-      </w:r>
-    </w:p>
-    <w:p>
-      <w:pPr>
-        <w:spacing w:line="360" w:lineRule="auto"/>
-        <w:rPr>
-          <w:lang w:val="en-US"/>
-        </w:rPr>
       </w:pPr>
     </w:p>
     <w:p>
@@ -2103,6 +2637,9 @@
         <w:ind w:firstLine="0"/>
       </w:pPr>
       <w:r>
+        <w:rPr>
+          <w:noProof/>
+        </w:rPr>
         <w:drawing>
           <wp:inline distT="0" distB="0" distL="0" distR="0" wp14:anchorId="211CF797" wp14:editId="381C243D">
             <wp:extent cx="5940425" cy="3356610"/>
@@ -2146,46 +2683,41 @@
         <w:spacing w:line="360" w:lineRule="auto"/>
       </w:pPr>
       <w:r>
-        <w:t xml:space="preserve">Рисунок </w:t>
+        <w:t xml:space="preserve">Рисунок 4 – График ИПХ </w:t>
+      </w:r>
+      <w:r>
+        <w:rPr>
+          <w:lang w:val="en-US"/>
+        </w:rPr>
+        <w:t>S</w:t>
+      </w:r>
+      <w:r>
+        <w:t>01_</w:t>
+      </w:r>
+      <w:r>
+        <w:rPr>
+          <w:lang w:val="en-US"/>
+        </w:rPr>
+        <w:t>M</w:t>
+      </w:r>
+      <w:r>
+        <w:t>0</w:t>
       </w:r>
       <w:r>
         <w:t>4</w:t>
       </w:r>
-      <w:r>
-        <w:t xml:space="preserve"> – График ИПХ </w:t>
-      </w:r>
-      <w:r>
+    </w:p>
+    <w:p>
+      <w:pPr>
+        <w:pStyle w:val="af"/>
+        <w:ind w:firstLine="0"/>
         <w:rPr>
           <w:lang w:val="en-US"/>
         </w:rPr>
-        <w:t>S</w:t>
-      </w:r>
-      <w:r>
-        <w:t>01_</w:t>
-      </w:r>
-      <w:r>
-        <w:rPr>
-          <w:lang w:val="en-US"/>
-        </w:rPr>
-        <w:t>M</w:t>
-      </w:r>
-      <w:r>
-        <w:t>0</w:t>
-      </w:r>
-      <w:r>
-        <w:t>4</w:t>
-      </w:r>
-    </w:p>
-    <w:p>
-      <w:pPr>
-        <w:pStyle w:val="af"/>
-        <w:ind w:firstLine="0"/>
-        <w:rPr>
-          <w:lang w:val="en-US"/>
-        </w:rPr>
-      </w:pPr>
-      <w:r>
-        <w:rPr>
+      </w:pPr>
+      <w:r>
+        <w:rPr>
+          <w:noProof/>
           <w:lang w:val="en-US"/>
         </w:rPr>
         <w:lastRenderedPageBreak/>
@@ -2235,13 +2767,7 @@
         </w:rPr>
       </w:pPr>
       <w:r>
-        <w:t xml:space="preserve">Рисунок </w:t>
-      </w:r>
-      <w:r>
-        <w:t>5</w:t>
-      </w:r>
-      <w:r>
-        <w:t xml:space="preserve"> – График ИПХ </w:t>
+        <w:t xml:space="preserve">Рисунок 5 – График ИПХ </w:t>
       </w:r>
       <w:r>
         <w:rPr>
@@ -2289,6 +2815,7 @@
       </w:pPr>
       <w:r>
         <w:rPr>
+          <w:noProof/>
           <w:lang w:val="en-US"/>
         </w:rPr>
         <w:drawing>
@@ -2334,13 +2861,7 @@
         <w:spacing w:line="360" w:lineRule="auto"/>
       </w:pPr>
       <w:r>
-        <w:t xml:space="preserve">Рисунок </w:t>
-      </w:r>
-      <w:r>
-        <w:t>6</w:t>
-      </w:r>
-      <w:r>
-        <w:t xml:space="preserve"> – График ИПХ </w:t>
+        <w:t xml:space="preserve">Рисунок 6 – График ИПХ </w:t>
       </w:r>
       <w:r>
         <w:rPr>
@@ -2380,6 +2901,7 @@
       </w:pPr>
       <w:r>
         <w:rPr>
+          <w:noProof/>
           <w:lang w:val="en-US"/>
         </w:rPr>
         <w:lastRenderedPageBreak/>
@@ -2429,13 +2951,7 @@
         </w:rPr>
       </w:pPr>
       <w:r>
-        <w:t xml:space="preserve">Рисунок </w:t>
-      </w:r>
-      <w:r>
-        <w:t>7</w:t>
-      </w:r>
-      <w:r>
-        <w:t xml:space="preserve"> – График ИПХ </w:t>
+        <w:t xml:space="preserve">Рисунок 7 – График ИПХ </w:t>
       </w:r>
       <w:r>
         <w:rPr>
@@ -2482,6 +2998,7 @@
       </w:pPr>
       <w:r>
         <w:rPr>
+          <w:noProof/>
           <w:lang w:val="en-US"/>
         </w:rPr>
         <w:drawing>
@@ -2527,13 +3044,7 @@
         <w:spacing w:line="360" w:lineRule="auto"/>
       </w:pPr>
       <w:r>
-        <w:t xml:space="preserve">Рисунок </w:t>
-      </w:r>
-      <w:r>
-        <w:t>8</w:t>
-      </w:r>
-      <w:r>
-        <w:t xml:space="preserve"> – График ИПХ </w:t>
+        <w:t xml:space="preserve">Рисунок 8 – График ИПХ </w:t>
       </w:r>
       <w:r>
         <w:rPr>
@@ -2592,7 +3103,8 @@
           <w:szCs w:val="32"/>
         </w:rPr>
       </w:pPr>
-      <w:bookmarkStart w:id="3" w:name="_Toc217333516"/>
+      <w:bookmarkStart w:id="6" w:name="_Toc217333516"/>
+      <w:bookmarkStart w:id="7" w:name="_Toc219186187"/>
       <w:r>
         <w:rPr>
           <w:sz w:val="32"/>
@@ -2601,7 +3113,8 @@
         <w:lastRenderedPageBreak/>
         <w:t>2.2 Расчет акустических параметров помещения</w:t>
       </w:r>
-      <w:bookmarkEnd w:id="3"/>
+      <w:bookmarkEnd w:id="6"/>
+      <w:bookmarkEnd w:id="7"/>
     </w:p>
     <w:p>
       <w:pPr>
@@ -2882,6 +3395,9 @@
         <w:ind w:firstLine="0"/>
       </w:pPr>
       <w:r>
+        <w:rPr>
+          <w:noProof/>
+        </w:rPr>
         <w:lastRenderedPageBreak/>
         <w:drawing>
           <wp:inline distT="0" distB="0" distL="0" distR="0" wp14:anchorId="2B441EC2" wp14:editId="082E3886">
@@ -2954,6 +3470,9 @@
         <w:ind w:firstLine="0"/>
       </w:pPr>
       <w:r>
+        <w:rPr>
+          <w:noProof/>
+        </w:rPr>
         <w:drawing>
           <wp:inline distT="0" distB="0" distL="0" distR="0" wp14:anchorId="63C86C8C" wp14:editId="07C474DB">
             <wp:extent cx="5940425" cy="3345815"/>
@@ -3027,6 +3546,9 @@
         <w:ind w:firstLine="0"/>
       </w:pPr>
       <w:r>
+        <w:rPr>
+          <w:noProof/>
+        </w:rPr>
         <w:lastRenderedPageBreak/>
         <w:drawing>
           <wp:inline distT="0" distB="0" distL="0" distR="0" wp14:anchorId="0A9DCA6F" wp14:editId="5098A831">
@@ -3102,6 +3624,9 @@
         <w:ind w:firstLine="0"/>
       </w:pPr>
       <w:r>
+        <w:rPr>
+          <w:noProof/>
+        </w:rPr>
         <w:drawing>
           <wp:inline distT="0" distB="0" distL="0" distR="0" wp14:anchorId="5E92557D" wp14:editId="1845CF86">
             <wp:extent cx="5940425" cy="3343910"/>
@@ -3176,6 +3701,9 @@
         <w:ind w:firstLine="0"/>
       </w:pPr>
       <w:r>
+        <w:rPr>
+          <w:noProof/>
+        </w:rPr>
         <w:lastRenderedPageBreak/>
         <w:drawing>
           <wp:inline distT="0" distB="0" distL="0" distR="0" wp14:anchorId="2F7A13E7" wp14:editId="57E13BA5">
@@ -3251,6 +3779,9 @@
         <w:ind w:firstLine="0"/>
       </w:pPr>
       <w:r>
+        <w:rPr>
+          <w:noProof/>
+        </w:rPr>
         <w:drawing>
           <wp:inline distT="0" distB="0" distL="0" distR="0" wp14:anchorId="40B9F38E" wp14:editId="3FB20DFB">
             <wp:extent cx="5940425" cy="3362960"/>
@@ -3330,6 +3861,9 @@
         <w:spacing w:line="360" w:lineRule="auto"/>
       </w:pPr>
       <w:r>
+        <w:rPr>
+          <w:noProof/>
+        </w:rPr>
         <w:lastRenderedPageBreak/>
         <w:drawing>
           <wp:inline distT="0" distB="0" distL="0" distR="0" wp14:anchorId="057CD9BC" wp14:editId="5EBCF413">
@@ -3404,6 +3938,9 @@
         <w:spacing w:line="360" w:lineRule="auto"/>
       </w:pPr>
       <w:r>
+        <w:rPr>
+          <w:noProof/>
+        </w:rPr>
         <w:drawing>
           <wp:inline distT="0" distB="0" distL="0" distR="0" wp14:anchorId="26B35214" wp14:editId="3248C92A">
             <wp:extent cx="5940425" cy="3362960"/>
@@ -3505,19 +4042,7 @@
         <w:t>01</w:t>
       </w:r>
       <w:r>
-        <w:t xml:space="preserve"> недостоверным времен</w:t>
-      </w:r>
-      <w:r>
-        <w:t>ем</w:t>
-      </w:r>
-      <w:r>
-        <w:t xml:space="preserve"> реверберации явля</w:t>
-      </w:r>
-      <w:r>
-        <w:t>е</w:t>
-      </w:r>
-      <w:r>
-        <w:t xml:space="preserve">тся: </w:t>
+        <w:t xml:space="preserve"> недостоверным временем реверберации является: </w:t>
       </w:r>
       <w:r>
         <w:rPr>
@@ -3626,10 +4151,7 @@
         <w:t>0</w:t>
       </w:r>
       <w:r>
-        <w:t>3</w:t>
-      </w:r>
-      <w:r>
-        <w:t xml:space="preserve"> и </w:t>
+        <w:t xml:space="preserve">3 и </w:t>
       </w:r>
       <w:r>
         <w:rPr>
@@ -3689,186 +4211,2092 @@
         <w:t>01</w:t>
       </w:r>
       <w:r>
-        <w:t xml:space="preserve"> недостоверным времен</w:t>
+        <w:t xml:space="preserve"> недостоверным временем реверберации является: </w:t>
+      </w:r>
+      <w:r>
+        <w:rPr>
+          <w:lang w:val="en-US"/>
+        </w:rPr>
+        <w:t>T</w:t>
+      </w:r>
+      <w:r>
+        <w:t xml:space="preserve">30 </w:t>
+      </w:r>
+      <w:r>
+        <w:t>на 1000 Гц.</w:t>
+      </w:r>
+    </w:p>
+    <w:p>
+      <w:pPr>
+        <w:pStyle w:val="af"/>
+      </w:pPr>
+      <w:r>
+        <w:t>На графике</w:t>
+      </w:r>
+      <w:r>
+        <w:t xml:space="preserve"> </w:t>
+      </w:r>
+      <w:r>
+        <w:rPr>
+          <w:lang w:val="en-US"/>
+        </w:rPr>
+        <w:t>S</w:t>
+      </w:r>
+      <w:r>
+        <w:t>0</w:t>
+      </w:r>
+      <w:r>
+        <w:t>2</w:t>
+      </w:r>
+      <w:r>
+        <w:t>_</w:t>
+      </w:r>
+      <w:r>
+        <w:rPr>
+          <w:lang w:val="en-US"/>
+        </w:rPr>
+        <w:t>M</w:t>
+      </w:r>
+      <w:r>
+        <w:t>0</w:t>
+      </w:r>
+      <w:r>
+        <w:t>2 все времена реверберации достоверны.</w:t>
+      </w:r>
+    </w:p>
+    <w:p>
+      <w:pPr>
+        <w:pStyle w:val="af"/>
+      </w:pPr>
+      <w:r>
+        <w:t>На графике</w:t>
+      </w:r>
+      <w:r>
+        <w:t xml:space="preserve"> </w:t>
+      </w:r>
+      <w:r>
+        <w:rPr>
+          <w:lang w:val="en-US"/>
+        </w:rPr>
+        <w:t>S</w:t>
+      </w:r>
+      <w:r>
+        <w:t>0</w:t>
+      </w:r>
+      <w:r>
+        <w:t>2</w:t>
+      </w:r>
+      <w:r>
+        <w:t>_</w:t>
+      </w:r>
+      <w:r>
+        <w:rPr>
+          <w:lang w:val="en-US"/>
+        </w:rPr>
+        <w:t>M</w:t>
+      </w:r>
+      <w:r>
+        <w:t>0</w:t>
+      </w:r>
+      <w:r>
+        <w:t xml:space="preserve">3 недостоверным временем реверберации является: </w:t>
+      </w:r>
+      <w:r>
+        <w:rPr>
+          <w:lang w:val="en-US"/>
+        </w:rPr>
+        <w:t>T</w:t>
+      </w:r>
+      <w:r>
+        <w:t>2</w:t>
+      </w:r>
+      <w:r>
+        <w:t xml:space="preserve">0 </w:t>
+      </w:r>
+      <w:r>
+        <w:t>на 125 Гц.</w:t>
+      </w:r>
+    </w:p>
+    <w:p>
+      <w:pPr>
+        <w:pStyle w:val="af"/>
+      </w:pPr>
+      <w:r>
+        <w:t>На графике</w:t>
+      </w:r>
+      <w:r>
+        <w:t xml:space="preserve"> </w:t>
+      </w:r>
+      <w:r>
+        <w:rPr>
+          <w:lang w:val="en-US"/>
+        </w:rPr>
+        <w:t>S</w:t>
+      </w:r>
+      <w:r>
+        <w:t>0</w:t>
+      </w:r>
+      <w:r>
+        <w:t>2</w:t>
+      </w:r>
+      <w:r>
+        <w:t>_</w:t>
+      </w:r>
+      <w:r>
+        <w:rPr>
+          <w:lang w:val="en-US"/>
+        </w:rPr>
+        <w:t>M</w:t>
+      </w:r>
+      <w:r>
+        <w:t>0</w:t>
+      </w:r>
+      <w:r>
+        <w:t>4 все времена реверберации достоверны.</w:t>
+      </w:r>
+    </w:p>
+    <w:p>
+      <w:pPr>
+        <w:pStyle w:val="af"/>
+      </w:pPr>
+      <w:r>
+        <w:t>Сохраним текстовый файл, в котором будут значения частотных зависимостей акустических параметров помещения.</w:t>
+      </w:r>
+    </w:p>
+    <w:p>
+      <w:pPr>
+        <w:rPr>
+          <w:rFonts w:eastAsiaTheme="minorHAnsi" w:cstheme="minorBidi"/>
+          <w:kern w:val="2"/>
+          <w:sz w:val="28"/>
+          <w14:ligatures w14:val="standardContextual"/>
+        </w:rPr>
+      </w:pPr>
+      <w:r>
+        <w:br w:type="page"/>
+      </w:r>
+    </w:p>
+    <w:p>
+      <w:pPr>
+        <w:pStyle w:val="af4"/>
+        <w:ind w:firstLine="0"/>
+        <w:jc w:val="center"/>
+        <w:outlineLvl w:val="1"/>
+        <w:rPr>
+          <w:sz w:val="32"/>
+          <w:szCs w:val="32"/>
+        </w:rPr>
+      </w:pPr>
+      <w:bookmarkStart w:id="8" w:name="_Toc219186188"/>
+      <w:r>
+        <w:rPr>
+          <w:sz w:val="32"/>
+          <w:szCs w:val="32"/>
+        </w:rPr>
+        <w:lastRenderedPageBreak/>
+        <w:t xml:space="preserve">2.3 </w:t>
+      </w:r>
+      <w:r>
+        <w:rPr>
+          <w:sz w:val="32"/>
+          <w:szCs w:val="32"/>
+        </w:rPr>
+        <w:t>Пространственное усреднение результатов измерений</w:t>
+      </w:r>
+      <w:bookmarkEnd w:id="8"/>
+    </w:p>
+    <w:p>
+      <w:pPr>
+        <w:pStyle w:val="af"/>
+      </w:pPr>
+    </w:p>
+    <w:p>
+      <w:pPr>
+        <w:pStyle w:val="af4"/>
+        <w:ind w:firstLine="0"/>
+        <w:jc w:val="center"/>
+        <w:rPr>
+          <w:sz w:val="32"/>
+          <w:szCs w:val="32"/>
+        </w:rPr>
+      </w:pPr>
+      <w:r>
+        <w:rPr>
+          <w:sz w:val="32"/>
+          <w:szCs w:val="32"/>
+        </w:rPr>
+        <w:t>Расчет пространственного среднего</w:t>
+      </w:r>
+    </w:p>
+    <w:p>
+      <w:pPr>
+        <w:pStyle w:val="af"/>
+      </w:pPr>
+    </w:p>
+    <w:p>
+      <w:pPr>
+        <w:pStyle w:val="af"/>
+      </w:pPr>
+      <w:r>
+        <w:t>Результаты измерений, полученные для некоторой области расположения источника звука и микрофона, могут быть объединены как для определенных частей помещения, так и помещения в целом для получения пространствен</w:t>
+      </w:r>
+      <w:r>
+        <w:t>н</w:t>
+      </w:r>
+      <w:r>
+        <w:t>о</w:t>
+      </w:r>
+      <w:r>
+        <w:t>-</w:t>
+      </w:r>
+      <w:r>
+        <w:t>усредненных величин. Такое пространственное усреднение должно выполняться арифметическим усреднением времен реверберации</w:t>
+      </w:r>
+      <w:r>
+        <w:t>.</w:t>
+      </w:r>
+    </w:p>
+    <w:p>
+      <w:pPr>
+        <w:pStyle w:val="af"/>
+      </w:pPr>
+      <w:r>
+        <w:t xml:space="preserve">Для этого рассчитаем пространственное среднее как </w:t>
+      </w:r>
+      <w:r>
+        <w:t>среднее арифметическое значений для всех независимых сочетаний положений источника и микрофона в соответствии</w:t>
+      </w:r>
+      <w:r>
+        <w:t xml:space="preserve"> с (1):</w:t>
+      </w:r>
+    </w:p>
+    <w:p>
+      <w:pPr>
+        <w:pStyle w:val="af"/>
+      </w:pPr>
+    </w:p>
+    <w:p>
+      <w:pPr>
+        <w:pStyle w:val="af"/>
+        <w:rPr>
+          <w:rFonts w:eastAsiaTheme="minorEastAsia"/>
+          <w:lang w:val="en-US"/>
+        </w:rPr>
+      </w:pPr>
+      <m:oMathPara>
+        <m:oMath>
+          <m:eqArr>
+            <m:eqArrPr>
+              <m:maxDist m:val="1"/>
+              <m:ctrlPr>
+                <w:rPr>
+                  <w:rFonts w:ascii="Cambria Math" w:hAnsi="Cambria Math"/>
+                  <w:i/>
+                  <w:lang w:val="en-US"/>
+                </w:rPr>
+              </m:ctrlPr>
+            </m:eqArrPr>
+            <m:e>
+              <m:acc>
+                <m:accPr>
+                  <m:chr m:val="̅"/>
+                  <m:ctrlPr>
+                    <w:rPr>
+                      <w:rFonts w:ascii="Cambria Math" w:hAnsi="Cambria Math"/>
+                      <w:i/>
+                    </w:rPr>
+                  </m:ctrlPr>
+                </m:accPr>
+                <m:e>
+                  <m:r>
+                    <w:rPr>
+                      <w:rFonts w:ascii="Cambria Math" w:hAnsi="Cambria Math"/>
+                      <w:lang w:val="en-US"/>
+                    </w:rPr>
+                    <m:t>X</m:t>
+                  </m:r>
+                </m:e>
+              </m:acc>
+              <m:r>
+                <w:rPr>
+                  <w:rFonts w:ascii="Cambria Math" w:hAnsi="Cambria Math"/>
+                </w:rPr>
+                <m:t>=</m:t>
+              </m:r>
+              <m:f>
+                <m:fPr>
+                  <m:ctrlPr>
+                    <w:rPr>
+                      <w:rFonts w:ascii="Cambria Math" w:hAnsi="Cambria Math"/>
+                      <w:i/>
+                      <w:lang w:val="en-US"/>
+                    </w:rPr>
+                  </m:ctrlPr>
+                </m:fPr>
+                <m:num>
+                  <m:r>
+                    <w:rPr>
+                      <w:rFonts w:ascii="Cambria Math" w:hAnsi="Cambria Math"/>
+                      <w:lang w:val="en-US"/>
+                    </w:rPr>
+                    <m:t>1</m:t>
+                  </m:r>
+                </m:num>
+                <m:den>
+                  <m:r>
+                    <w:rPr>
+                      <w:rFonts w:ascii="Cambria Math" w:hAnsi="Cambria Math"/>
+                      <w:lang w:val="en-US"/>
+                    </w:rPr>
+                    <m:t>m*n</m:t>
+                  </m:r>
+                </m:den>
+              </m:f>
+              <m:nary>
+                <m:naryPr>
+                  <m:chr m:val="∑"/>
+                  <m:limLoc m:val="undOvr"/>
+                  <m:ctrlPr>
+                    <w:rPr>
+                      <w:rFonts w:ascii="Cambria Math" w:hAnsi="Cambria Math"/>
+                      <w:i/>
+                      <w:lang w:val="en-US"/>
+                    </w:rPr>
+                  </m:ctrlPr>
+                </m:naryPr>
+                <m:sub>
+                  <m:r>
+                    <w:rPr>
+                      <w:rFonts w:ascii="Cambria Math" w:hAnsi="Cambria Math"/>
+                      <w:lang w:val="en-US"/>
+                    </w:rPr>
+                    <m:t>i=1</m:t>
+                  </m:r>
+                </m:sub>
+                <m:sup>
+                  <m:r>
+                    <w:rPr>
+                      <w:rFonts w:ascii="Cambria Math" w:hAnsi="Cambria Math"/>
+                      <w:lang w:val="en-US"/>
+                    </w:rPr>
+                    <m:t>m*n</m:t>
+                  </m:r>
+                </m:sup>
+                <m:e>
+                  <m:sSub>
+                    <m:sSubPr>
+                      <m:ctrlPr>
+                        <w:rPr>
+                          <w:rFonts w:ascii="Cambria Math" w:hAnsi="Cambria Math"/>
+                          <w:i/>
+                          <w:lang w:val="en-US"/>
+                        </w:rPr>
+                      </m:ctrlPr>
+                    </m:sSubPr>
+                    <m:e>
+                      <m:r>
+                        <w:rPr>
+                          <w:rFonts w:ascii="Cambria Math" w:hAnsi="Cambria Math"/>
+                          <w:lang w:val="en-US"/>
+                        </w:rPr>
+                        <m:t>X</m:t>
+                      </m:r>
+                    </m:e>
+                    <m:sub>
+                      <m:r>
+                        <w:rPr>
+                          <w:rFonts w:ascii="Cambria Math" w:hAnsi="Cambria Math"/>
+                          <w:lang w:val="en-US"/>
+                        </w:rPr>
+                        <m:t>i</m:t>
+                      </m:r>
+                    </m:sub>
+                  </m:sSub>
+                </m:e>
+              </m:nary>
+              <m:r>
+                <w:rPr>
+                  <w:rFonts w:ascii="Cambria Math" w:hAnsi="Cambria Math"/>
+                  <w:lang w:val="en-US"/>
+                </w:rPr>
+                <m:t xml:space="preserve">, </m:t>
+              </m:r>
+              <m:r>
+                <w:rPr>
+                  <w:rFonts w:ascii="Cambria Math" w:hAnsi="Cambria Math"/>
+                </w:rPr>
+                <m:t>#</m:t>
+              </m:r>
+              <m:d>
+                <m:dPr>
+                  <m:ctrlPr>
+                    <w:rPr>
+                      <w:rFonts w:ascii="Cambria Math" w:hAnsi="Cambria Math"/>
+                      <w:i/>
+                      <w:lang w:val="en-US"/>
+                    </w:rPr>
+                  </m:ctrlPr>
+                </m:dPr>
+                <m:e>
+                  <m:r>
+                    <w:rPr>
+                      <w:rFonts w:ascii="Cambria Math" w:hAnsi="Cambria Math"/>
+                      <w:lang w:val="en-US"/>
+                    </w:rPr>
+                    <m:t>1</m:t>
+                  </m:r>
+                </m:e>
+              </m:d>
+              <m:ctrlPr>
+                <w:rPr>
+                  <w:rFonts w:ascii="Cambria Math" w:hAnsi="Cambria Math"/>
+                  <w:i/>
+                </w:rPr>
+              </m:ctrlPr>
+            </m:e>
+          </m:eqArr>
+        </m:oMath>
+      </m:oMathPara>
+    </w:p>
+    <w:p>
+      <w:pPr>
+        <w:pStyle w:val="af"/>
+        <w:ind w:firstLine="0"/>
+        <w:rPr>
+          <w:rFonts w:eastAsiaTheme="minorEastAsia"/>
+        </w:rPr>
+      </w:pPr>
+    </w:p>
+    <w:p>
+      <w:pPr>
+        <w:pStyle w:val="af"/>
+        <w:ind w:firstLine="0"/>
+        <w:rPr>
+          <w:rFonts w:eastAsiaTheme="minorEastAsia"/>
+        </w:rPr>
+      </w:pPr>
+      <w:r>
+        <w:rPr>
+          <w:rFonts w:eastAsiaTheme="minorEastAsia"/>
+        </w:rPr>
+        <w:t xml:space="preserve">где </w:t>
+      </w:r>
+      <w:r>
+        <w:rPr>
+          <w:rFonts w:eastAsiaTheme="minorEastAsia"/>
+        </w:rPr>
+        <w:t xml:space="preserve">m — общее число позиций источника; n — общее число точек измерения; </w:t>
+      </w:r>
+      <w:proofErr w:type="spellStart"/>
+      <w:r>
+        <w:rPr>
+          <w:rFonts w:eastAsiaTheme="minorEastAsia"/>
+        </w:rPr>
+        <w:t>X</w:t>
+      </w:r>
+      <w:r>
+        <w:rPr>
+          <w:rFonts w:eastAsiaTheme="minorEastAsia"/>
+          <w:vertAlign w:val="subscript"/>
+        </w:rPr>
+        <w:t>i</w:t>
+      </w:r>
+      <w:proofErr w:type="spellEnd"/>
+      <w:r>
+        <w:rPr>
+          <w:rFonts w:eastAsiaTheme="minorEastAsia"/>
+        </w:rPr>
+        <w:t> — акустический параметр помещения, измеренный для i-той конфигурации источник-микрофон по методу КЧ.</w:t>
+      </w:r>
+    </w:p>
+    <w:p>
+      <w:pPr>
+        <w:pStyle w:val="af"/>
+      </w:pPr>
+      <w:r>
+        <w:t>Результаты расчёта занесём в табл</w:t>
+      </w:r>
+      <w:r>
+        <w:t xml:space="preserve">ице </w:t>
+      </w:r>
+      <w:r>
+        <w:t>2.</w:t>
+      </w:r>
+    </w:p>
+    <w:p>
+      <w:pPr>
+        <w:pStyle w:val="af6"/>
+        <w:spacing w:line="360" w:lineRule="auto"/>
+        <w:jc w:val="right"/>
+      </w:pPr>
+      <w:r>
+        <w:t>Таблица 2 – Пространственное среднее акустических параметров помещений</w:t>
+      </w:r>
+    </w:p>
+    <w:tbl>
+      <w:tblPr>
+        <w:tblStyle w:val="a6"/>
+        <w:tblW w:w="5000" w:type="pct"/>
+        <w:tblLook w:val="04A0" w:firstRow="1" w:lastRow="0" w:firstColumn="1" w:lastColumn="0" w:noHBand="0" w:noVBand="1"/>
+      </w:tblPr>
+      <w:tblGrid>
+        <w:gridCol w:w="4672"/>
+        <w:gridCol w:w="4673"/>
+      </w:tblGrid>
+      <w:tr>
+        <w:tc>
+          <w:tcPr>
+            <w:tcW w:w="2500" w:type="pct"/>
+          </w:tcPr>
+          <w:p>
+            <w:pPr>
+              <w:pStyle w:val="af8"/>
+            </w:pPr>
+            <w:r>
+              <w:t>Параметр</w:t>
+            </w:r>
+          </w:p>
+        </w:tc>
+        <w:tc>
+          <w:tcPr>
+            <w:tcW w:w="2500" w:type="pct"/>
+          </w:tcPr>
+          <w:p>
+            <w:pPr>
+              <w:pStyle w:val="af8"/>
+            </w:pPr>
+            <w:r>
+              <w:t>Значение</w:t>
+            </w:r>
+          </w:p>
+        </w:tc>
+      </w:tr>
+      <w:tr>
+        <w:tc>
+          <w:tcPr>
+            <w:tcW w:w="2500" w:type="pct"/>
+          </w:tcPr>
+          <w:p>
+            <w:pPr>
+              <w:pStyle w:val="af8"/>
+            </w:pPr>
+            <w:r>
+              <w:t>Время реверберации T</w:t>
+            </w:r>
+            <w:r>
+              <w:rPr>
+                <w:vertAlign w:val="subscript"/>
+              </w:rPr>
+              <w:t>OPT</w:t>
+            </w:r>
+            <w:r>
+              <w:t>, с</w:t>
+            </w:r>
+          </w:p>
+        </w:tc>
+        <w:tc>
+          <w:tcPr>
+            <w:tcW w:w="2500" w:type="pct"/>
+          </w:tcPr>
+          <w:p>
+            <w:pPr>
+              <w:pStyle w:val="af8"/>
+            </w:pPr>
+            <w:r>
+              <w:t>1,001</w:t>
+            </w:r>
+          </w:p>
+        </w:tc>
+      </w:tr>
+      <w:tr>
+        <w:tc>
+          <w:tcPr>
+            <w:tcW w:w="2500" w:type="pct"/>
+          </w:tcPr>
+          <w:p>
+            <w:pPr>
+              <w:pStyle w:val="af8"/>
+            </w:pPr>
+            <w:r>
+              <w:t>Раннее время спада EDT, с</w:t>
+            </w:r>
+          </w:p>
+        </w:tc>
+        <w:tc>
+          <w:tcPr>
+            <w:tcW w:w="2500" w:type="pct"/>
+          </w:tcPr>
+          <w:p>
+            <w:pPr>
+              <w:pStyle w:val="af8"/>
+            </w:pPr>
+            <w:r>
+              <w:t>0,903</w:t>
+            </w:r>
+          </w:p>
+        </w:tc>
+      </w:tr>
+      <w:tr>
+        <w:tc>
+          <w:tcPr>
+            <w:tcW w:w="2500" w:type="pct"/>
+          </w:tcPr>
+          <w:p>
+            <w:pPr>
+              <w:pStyle w:val="af8"/>
+            </w:pPr>
+            <w:r>
+              <w:t>Время реверберации T</w:t>
+            </w:r>
+            <w:r>
+              <w:rPr>
+                <w:vertAlign w:val="subscript"/>
+              </w:rPr>
+              <w:t>20</w:t>
+            </w:r>
+            <w:r>
+              <w:t>, с</w:t>
+            </w:r>
+          </w:p>
+        </w:tc>
+        <w:tc>
+          <w:tcPr>
+            <w:tcW w:w="2500" w:type="pct"/>
+          </w:tcPr>
+          <w:p>
+            <w:pPr>
+              <w:pStyle w:val="af8"/>
+            </w:pPr>
+            <w:r>
+              <w:t>0,929</w:t>
+            </w:r>
+          </w:p>
+        </w:tc>
+      </w:tr>
+      <w:tr>
+        <w:tc>
+          <w:tcPr>
+            <w:tcW w:w="2500" w:type="pct"/>
+          </w:tcPr>
+          <w:p>
+            <w:pPr>
+              <w:pStyle w:val="af8"/>
+            </w:pPr>
+            <w:r>
+              <w:t>Время реверберации T</w:t>
+            </w:r>
+            <w:r>
+              <w:rPr>
+                <w:vertAlign w:val="subscript"/>
+              </w:rPr>
+              <w:t>30</w:t>
+            </w:r>
+            <w:r>
+              <w:t>, с</w:t>
+            </w:r>
+          </w:p>
+        </w:tc>
+        <w:tc>
+          <w:tcPr>
+            <w:tcW w:w="2500" w:type="pct"/>
+          </w:tcPr>
+          <w:p>
+            <w:pPr>
+              <w:pStyle w:val="af8"/>
+            </w:pPr>
+            <w:r>
+              <w:t>0,991</w:t>
+            </w:r>
+          </w:p>
+        </w:tc>
+      </w:tr>
+      <w:tr>
+        <w:tc>
+          <w:tcPr>
+            <w:tcW w:w="2500" w:type="pct"/>
+          </w:tcPr>
+          <w:p>
+            <w:pPr>
+              <w:pStyle w:val="af8"/>
+            </w:pPr>
+            <w:r>
+              <w:t>Индекс четкости С</w:t>
+            </w:r>
+            <w:r>
+              <w:rPr>
+                <w:vertAlign w:val="subscript"/>
+              </w:rPr>
+              <w:t>50</w:t>
+            </w:r>
+            <w:r>
+              <w:t>, дБ</w:t>
+            </w:r>
+          </w:p>
+        </w:tc>
+        <w:tc>
+          <w:tcPr>
+            <w:tcW w:w="2500" w:type="pct"/>
+          </w:tcPr>
+          <w:p>
+            <w:pPr>
+              <w:pStyle w:val="af8"/>
+            </w:pPr>
+            <w:r>
+              <w:t>3,506</w:t>
+            </w:r>
+          </w:p>
+        </w:tc>
+      </w:tr>
+      <w:tr>
+        <w:tc>
+          <w:tcPr>
+            <w:tcW w:w="2500" w:type="pct"/>
+          </w:tcPr>
+          <w:p>
+            <w:pPr>
+              <w:pStyle w:val="af8"/>
+            </w:pPr>
+            <w:r>
+              <w:t>Ясность С</w:t>
+            </w:r>
+            <w:r>
+              <w:rPr>
+                <w:vertAlign w:val="subscript"/>
+              </w:rPr>
+              <w:t>80</w:t>
+            </w:r>
+            <w:r>
+              <w:t>, дБ</w:t>
+            </w:r>
+          </w:p>
+        </w:tc>
+        <w:tc>
+          <w:tcPr>
+            <w:tcW w:w="2500" w:type="pct"/>
+          </w:tcPr>
+          <w:p>
+            <w:pPr>
+              <w:pStyle w:val="af8"/>
+            </w:pPr>
+            <w:r>
+              <w:t>6,279</w:t>
+            </w:r>
+          </w:p>
+        </w:tc>
+      </w:tr>
+      <w:tr>
+        <w:tc>
+          <w:tcPr>
+            <w:tcW w:w="2500" w:type="pct"/>
+          </w:tcPr>
+          <w:p>
+            <w:pPr>
+              <w:pStyle w:val="af8"/>
+            </w:pPr>
+            <w:r>
+              <w:t>Четкость D</w:t>
+            </w:r>
+            <w:r>
+              <w:rPr>
+                <w:vertAlign w:val="subscript"/>
+              </w:rPr>
+              <w:t>50</w:t>
+            </w:r>
+            <w:r>
+              <w:t>, %</w:t>
+            </w:r>
+          </w:p>
+        </w:tc>
+        <w:tc>
+          <w:tcPr>
+            <w:tcW w:w="2500" w:type="pct"/>
+          </w:tcPr>
+          <w:p>
+            <w:pPr>
+              <w:pStyle w:val="af8"/>
+            </w:pPr>
+            <w:r>
+              <w:t>64,822</w:t>
+            </w:r>
+          </w:p>
+        </w:tc>
+      </w:tr>
+      <w:tr>
+        <w:tc>
+          <w:tcPr>
+            <w:tcW w:w="2500" w:type="pct"/>
+          </w:tcPr>
+          <w:p>
+            <w:pPr>
+              <w:pStyle w:val="af8"/>
+            </w:pPr>
+            <w:r>
+              <w:t>Центральный момент времени TS, с</w:t>
+            </w:r>
+          </w:p>
+        </w:tc>
+        <w:tc>
+          <w:tcPr>
+            <w:tcW w:w="2500" w:type="pct"/>
+          </w:tcPr>
+          <w:p>
+            <w:pPr>
+              <w:pStyle w:val="af8"/>
+            </w:pPr>
+            <w:r>
+              <w:t>0,058</w:t>
+            </w:r>
+          </w:p>
+        </w:tc>
+      </w:tr>
+    </w:tbl>
+    <w:p>
+      <w:pPr>
+        <w:pStyle w:val="af"/>
+      </w:pPr>
+    </w:p>
+    <w:p>
+      <w:pPr>
+        <w:rPr>
+          <w:rFonts w:eastAsiaTheme="minorHAnsi" w:cstheme="minorBidi"/>
+          <w:kern w:val="2"/>
+          <w:sz w:val="28"/>
+          <w14:ligatures w14:val="standardContextual"/>
+        </w:rPr>
+      </w:pPr>
+      <w:r>
+        <w:br w:type="page"/>
+      </w:r>
+    </w:p>
+    <w:p>
+      <w:pPr>
+        <w:pStyle w:val="af4"/>
+        <w:ind w:firstLine="0"/>
+        <w:jc w:val="center"/>
+      </w:pPr>
+      <w:r>
+        <w:lastRenderedPageBreak/>
+        <w:t>Неопределенность измерений</w:t>
+      </w:r>
+    </w:p>
+    <w:p>
+      <w:pPr>
+        <w:pStyle w:val="af"/>
+      </w:pPr>
+    </w:p>
+    <w:p>
+      <w:pPr>
+        <w:pStyle w:val="af"/>
+      </w:pPr>
+      <w:r>
+        <w:t>Для оценки точности времени реверберации TOPT, T20, T30 и раннего времени спада EDT, а также их пространственного изменения рассчит</w:t>
+      </w:r>
+      <w:r>
+        <w:t>аем</w:t>
+      </w:r>
+      <w:r>
+        <w:t xml:space="preserve"> для указанных частотных зависимостей стандартное отклонение в соответствии с</w:t>
+      </w:r>
+      <w:r>
+        <w:t xml:space="preserve"> (2):</w:t>
+      </w:r>
+    </w:p>
+    <w:p>
+      <w:pPr>
+        <w:pStyle w:val="af"/>
+      </w:pPr>
+    </w:p>
+    <w:p>
+      <w:pPr>
+        <w:pStyle w:val="af"/>
+        <w:rPr>
+          <w:rFonts w:eastAsiaTheme="minorEastAsia"/>
+          <w:lang w:val="en-US"/>
+        </w:rPr>
+      </w:pPr>
+      <m:oMathPara>
+        <m:oMath>
+          <m:eqArr>
+            <m:eqArrPr>
+              <m:maxDist m:val="1"/>
+              <m:ctrlPr>
+                <w:rPr>
+                  <w:rFonts w:ascii="Cambria Math" w:hAnsi="Cambria Math"/>
+                </w:rPr>
+              </m:ctrlPr>
+            </m:eqArrPr>
+            <m:e>
+              <m:acc>
+                <m:accPr>
+                  <m:chr m:val="̅"/>
+                  <m:ctrlPr>
+                    <w:rPr>
+                      <w:rFonts w:ascii="Cambria Math" w:hAnsi="Cambria Math"/>
+                    </w:rPr>
+                  </m:ctrlPr>
+                </m:accPr>
+                <m:e>
+                  <m:r>
+                    <w:rPr>
+                      <w:rFonts w:ascii="Cambria Math" w:hAnsi="Cambria Math"/>
+                    </w:rPr>
+                    <m:t>σ</m:t>
+                  </m:r>
+                </m:e>
+              </m:acc>
+              <m:d>
+                <m:dPr>
+                  <m:ctrlPr>
+                    <w:rPr>
+                      <w:rFonts w:ascii="Cambria Math" w:hAnsi="Cambria Math"/>
+                      <w:i/>
+                    </w:rPr>
+                  </m:ctrlPr>
+                </m:dPr>
+                <m:e>
+                  <m:acc>
+                    <m:accPr>
+                      <m:chr m:val="̅"/>
+                      <m:ctrlPr>
+                        <w:rPr>
+                          <w:rFonts w:ascii="Cambria Math" w:hAnsi="Cambria Math"/>
+                          <w:i/>
+                          <w:lang w:val="en-US"/>
+                        </w:rPr>
+                      </m:ctrlPr>
+                    </m:accPr>
+                    <m:e>
+                      <m:r>
+                        <w:rPr>
+                          <w:rFonts w:ascii="Cambria Math" w:hAnsi="Cambria Math"/>
+                          <w:lang w:val="en-US"/>
+                        </w:rPr>
+                        <m:t>T</m:t>
+                      </m:r>
+                    </m:e>
+                  </m:acc>
+                </m:e>
+              </m:d>
+              <m:r>
+                <w:rPr>
+                  <w:rFonts w:ascii="Cambria Math" w:hAnsi="Cambria Math"/>
+                  <w:lang w:val="en-US"/>
+                </w:rPr>
+                <m:t>=G*</m:t>
+              </m:r>
+              <m:acc>
+                <m:accPr>
+                  <m:chr m:val="̅"/>
+                  <m:ctrlPr>
+                    <w:rPr>
+                      <w:rFonts w:ascii="Cambria Math" w:hAnsi="Cambria Math"/>
+                      <w:i/>
+                      <w:lang w:val="en-US"/>
+                    </w:rPr>
+                  </m:ctrlPr>
+                </m:accPr>
+                <m:e>
+                  <m:r>
+                    <w:rPr>
+                      <w:rFonts w:ascii="Cambria Math" w:hAnsi="Cambria Math"/>
+                      <w:lang w:val="en-US"/>
+                    </w:rPr>
+                    <m:t>T</m:t>
+                  </m:r>
+                </m:e>
+              </m:acc>
+              <m:rad>
+                <m:radPr>
+                  <m:degHide m:val="1"/>
+                  <m:ctrlPr>
+                    <w:rPr>
+                      <w:rFonts w:ascii="Cambria Math" w:hAnsi="Cambria Math"/>
+                      <w:i/>
+                    </w:rPr>
+                  </m:ctrlPr>
+                </m:radPr>
+                <m:deg/>
+                <m:e>
+                  <m:f>
+                    <m:fPr>
+                      <m:ctrlPr>
+                        <w:rPr>
+                          <w:rFonts w:ascii="Cambria Math" w:hAnsi="Cambria Math"/>
+                          <w:i/>
+                        </w:rPr>
+                      </m:ctrlPr>
+                    </m:fPr>
+                    <m:num>
+                      <m:r>
+                        <w:rPr>
+                          <w:rFonts w:ascii="Cambria Math" w:hAnsi="Cambria Math"/>
+                        </w:rPr>
+                        <m:t>1</m:t>
+                      </m:r>
+                      <m:r>
+                        <w:rPr>
+                          <w:rFonts w:ascii="Cambria Math" w:hAnsi="Cambria Math"/>
+                          <w:lang w:val="en-US"/>
+                        </w:rPr>
+                        <m:t>+</m:t>
+                      </m:r>
+                      <m:f>
+                        <m:fPr>
+                          <m:type m:val="lin"/>
+                          <m:ctrlPr>
+                            <w:rPr>
+                              <w:rFonts w:ascii="Cambria Math" w:hAnsi="Cambria Math"/>
+                              <w:i/>
+                              <w:lang w:val="en-US"/>
+                            </w:rPr>
+                          </m:ctrlPr>
+                        </m:fPr>
+                        <m:num>
+                          <m:r>
+                            <w:rPr>
+                              <w:rFonts w:ascii="Cambria Math" w:hAnsi="Cambria Math"/>
+                              <w:lang w:val="en-US"/>
+                            </w:rPr>
+                            <m:t>H</m:t>
+                          </m:r>
+                        </m:num>
+                        <m:den>
+                          <m:r>
+                            <w:rPr>
+                              <w:rFonts w:ascii="Cambria Math" w:hAnsi="Cambria Math"/>
+                              <w:lang w:val="en-US"/>
+                            </w:rPr>
+                            <m:t>k</m:t>
+                          </m:r>
+                        </m:den>
+                      </m:f>
+                    </m:num>
+                    <m:den>
+                      <m:r>
+                        <w:rPr>
+                          <w:rFonts w:ascii="Cambria Math" w:hAnsi="Cambria Math"/>
+                        </w:rPr>
+                        <m:t>m</m:t>
+                      </m:r>
+                      <m:r>
+                        <w:rPr>
+                          <w:rFonts w:ascii="Cambria Math" w:hAnsi="Cambria Math"/>
+                          <w:lang w:val="en-US"/>
+                        </w:rPr>
+                        <m:t>*n*B*</m:t>
+                      </m:r>
+                      <m:acc>
+                        <m:accPr>
+                          <m:chr m:val="̅"/>
+                          <m:ctrlPr>
+                            <w:rPr>
+                              <w:rFonts w:ascii="Cambria Math" w:hAnsi="Cambria Math"/>
+                              <w:i/>
+                              <w:lang w:val="en-US"/>
+                            </w:rPr>
+                          </m:ctrlPr>
+                        </m:accPr>
+                        <m:e>
+                          <m:r>
+                            <w:rPr>
+                              <w:rFonts w:ascii="Cambria Math" w:hAnsi="Cambria Math"/>
+                              <w:lang w:val="en-US"/>
+                            </w:rPr>
+                            <m:t>T</m:t>
+                          </m:r>
+                        </m:e>
+                      </m:acc>
+                    </m:den>
+                  </m:f>
+                </m:e>
+              </m:rad>
+              <m:r>
+                <w:rPr>
+                  <w:rFonts w:ascii="Cambria Math" w:hAnsi="Cambria Math"/>
+                </w:rPr>
+                <m:t>,#</m:t>
+              </m:r>
+              <m:d>
+                <m:dPr>
+                  <m:ctrlPr>
+                    <w:rPr>
+                      <w:rFonts w:ascii="Cambria Math" w:hAnsi="Cambria Math"/>
+                      <w:i/>
+                      <w:lang w:val="en-US"/>
+                    </w:rPr>
+                  </m:ctrlPr>
+                </m:dPr>
+                <m:e>
+                  <m:r>
+                    <w:rPr>
+                      <w:rFonts w:ascii="Cambria Math" w:hAnsi="Cambria Math"/>
+                      <w:lang w:val="en-US"/>
+                    </w:rPr>
+                    <m:t>2</m:t>
+                  </m:r>
+                </m:e>
+              </m:d>
+              <m:ctrlPr>
+                <w:rPr>
+                  <w:rFonts w:ascii="Cambria Math" w:hAnsi="Cambria Math"/>
+                  <w:i/>
+                </w:rPr>
+              </m:ctrlPr>
+            </m:e>
+          </m:eqArr>
+        </m:oMath>
+      </m:oMathPara>
+    </w:p>
+    <w:p>
+      <w:pPr>
+        <w:pStyle w:val="af"/>
+        <w:ind w:firstLine="0"/>
+        <w:rPr>
+          <w:rFonts w:eastAsiaTheme="minorEastAsia"/>
+        </w:rPr>
+      </w:pPr>
+    </w:p>
+    <w:p>
+      <w:pPr>
+        <w:pStyle w:val="af"/>
+        <w:ind w:firstLine="0"/>
+        <w:rPr>
+          <w:rFonts w:eastAsiaTheme="minorEastAsia"/>
+        </w:rPr>
+      </w:pPr>
+      <w:r>
+        <w:rPr>
+          <w:rFonts w:eastAsiaTheme="minorEastAsia"/>
+        </w:rPr>
+        <w:t xml:space="preserve">где </w:t>
+      </w:r>
+      <w:r>
+        <w:rPr>
+          <w:rFonts w:eastAsiaTheme="minorEastAsia"/>
+        </w:rPr>
+        <w:t>G, H – константы, зависящие от интервала оценивания(</w:t>
+      </w:r>
+      <w:r>
+        <w:rPr>
+          <w:rFonts w:eastAsiaTheme="minorEastAsia"/>
+        </w:rPr>
+        <w:t>указаны в табл.3)</w:t>
+      </w:r>
+      <w:r>
+        <w:rPr>
+          <w:rFonts w:eastAsiaTheme="minorEastAsia"/>
+        </w:rPr>
+        <w:t xml:space="preserve">; </w:t>
+      </w:r>
+      <m:oMath>
+        <m:acc>
+          <m:accPr>
+            <m:chr m:val="̅"/>
+            <m:ctrlPr>
+              <w:rPr>
+                <w:rFonts w:ascii="Cambria Math" w:hAnsi="Cambria Math"/>
+                <w:i/>
+                <w:lang w:val="en-US"/>
+              </w:rPr>
+            </m:ctrlPr>
+          </m:accPr>
+          <m:e>
+            <m:r>
+              <w:rPr>
+                <w:rFonts w:ascii="Cambria Math" w:hAnsi="Cambria Math"/>
+                <w:lang w:val="en-US"/>
+              </w:rPr>
+              <m:t>T</m:t>
+            </m:r>
+          </m:e>
+        </m:acc>
+      </m:oMath>
+      <w:r>
+        <w:rPr>
+          <w:rFonts w:eastAsiaTheme="minorEastAsia"/>
+        </w:rPr>
+        <w:t> – среднее значение времени реверберации; B = 0,71f</w:t>
+      </w:r>
+      <w:r>
+        <w:rPr>
+          <w:rFonts w:eastAsiaTheme="minorEastAsia"/>
+          <w:vertAlign w:val="subscript"/>
+        </w:rPr>
+        <w:t>C</w:t>
+      </w:r>
+      <w:r>
+        <w:rPr>
+          <w:rFonts w:eastAsiaTheme="minorEastAsia"/>
+        </w:rPr>
+        <w:t xml:space="preserve"> – ширина полосы октавного фильтра, Гц; </w:t>
+      </w:r>
+      <w:proofErr w:type="spellStart"/>
+      <w:r>
+        <w:rPr>
+          <w:rFonts w:eastAsiaTheme="minorEastAsia"/>
+        </w:rPr>
+        <w:t>f</w:t>
+      </w:r>
+      <w:r>
+        <w:rPr>
+          <w:rFonts w:eastAsiaTheme="minorEastAsia"/>
+          <w:vertAlign w:val="subscript"/>
+        </w:rPr>
+        <w:t>C</w:t>
+      </w:r>
+      <w:proofErr w:type="spellEnd"/>
+      <w:r>
+        <w:rPr>
+          <w:rFonts w:eastAsiaTheme="minorEastAsia"/>
+        </w:rPr>
+        <w:t> – среднегеометрическая частота октавного фильтра (125, 250, 500, 1000, 2000, 4000, 8000 Гц); k – число кривых спада, измеренных в каждой конфигурации источник-микрофон; m – общее число позиций источника; n – общее число точек измерения.</w:t>
+      </w:r>
+    </w:p>
+    <w:p>
+      <w:pPr>
+        <w:pStyle w:val="af6"/>
+        <w:spacing w:line="360" w:lineRule="auto"/>
+        <w:jc w:val="right"/>
+      </w:pPr>
+      <w:r>
+        <w:t xml:space="preserve">Таблица 3 – </w:t>
+      </w:r>
+      <w:r>
+        <w:t>Значения констант G и H</w:t>
+      </w:r>
+    </w:p>
+    <w:tbl>
+      <w:tblPr>
+        <w:tblStyle w:val="a6"/>
+        <w:tblW w:w="0" w:type="auto"/>
+        <w:tblLook w:val="04A0" w:firstRow="1" w:lastRow="0" w:firstColumn="1" w:lastColumn="0" w:noHBand="0" w:noVBand="1"/>
+      </w:tblPr>
+      <w:tblGrid>
+        <w:gridCol w:w="3115"/>
+        <w:gridCol w:w="3115"/>
+        <w:gridCol w:w="3115"/>
+      </w:tblGrid>
+      <w:tr>
+        <w:tc>
+          <w:tcPr>
+            <w:tcW w:w="3115" w:type="dxa"/>
+          </w:tcPr>
+          <w:p>
+            <w:pPr>
+              <w:pStyle w:val="af8"/>
+            </w:pPr>
+            <w:r>
+              <w:t>Оцениваемое значение времени реверберации</w:t>
+            </w:r>
+          </w:p>
+        </w:tc>
+        <w:tc>
+          <w:tcPr>
+            <w:tcW w:w="3115" w:type="dxa"/>
+          </w:tcPr>
+          <w:p>
+            <w:pPr>
+              <w:pStyle w:val="af8"/>
+              <w:rPr>
+                <w:lang w:val="en-US"/>
+              </w:rPr>
+            </w:pPr>
+            <w:r>
+              <w:rPr>
+                <w:lang w:val="en-US"/>
+              </w:rPr>
+              <w:t>G</w:t>
+            </w:r>
+          </w:p>
+        </w:tc>
+        <w:tc>
+          <w:tcPr>
+            <w:tcW w:w="3115" w:type="dxa"/>
+          </w:tcPr>
+          <w:p>
+            <w:pPr>
+              <w:pStyle w:val="af8"/>
+              <w:rPr>
+                <w:lang w:val="en-US"/>
+              </w:rPr>
+            </w:pPr>
+            <w:r>
+              <w:rPr>
+                <w:lang w:val="en-US"/>
+              </w:rPr>
+              <w:t>H</w:t>
+            </w:r>
+          </w:p>
+        </w:tc>
+      </w:tr>
+      <w:tr>
+        <w:tc>
+          <w:tcPr>
+            <w:tcW w:w="3115" w:type="dxa"/>
+          </w:tcPr>
+          <w:p>
+            <w:pPr>
+              <w:pStyle w:val="af8"/>
+              <w:rPr>
+                <w:lang w:val="en-US"/>
+              </w:rPr>
+            </w:pPr>
+            <w:r>
+              <w:rPr>
+                <w:lang w:val="en-US"/>
+              </w:rPr>
+              <w:t>EDT</w:t>
+            </w:r>
+          </w:p>
+        </w:tc>
+        <w:tc>
+          <w:tcPr>
+            <w:tcW w:w="3115" w:type="dxa"/>
+          </w:tcPr>
+          <w:p>
+            <w:pPr>
+              <w:pStyle w:val="af8"/>
+              <w:rPr>
+                <w:lang w:val="en-US"/>
+              </w:rPr>
+            </w:pPr>
+            <w:r>
+              <w:rPr>
+                <w:lang w:val="en-US"/>
+              </w:rPr>
+              <w:t>1,75</w:t>
+            </w:r>
+          </w:p>
+        </w:tc>
+        <w:tc>
+          <w:tcPr>
+            <w:tcW w:w="3115" w:type="dxa"/>
+          </w:tcPr>
+          <w:p>
+            <w:pPr>
+              <w:pStyle w:val="af8"/>
+              <w:rPr>
+                <w:lang w:val="en-US"/>
+              </w:rPr>
+            </w:pPr>
+            <w:r>
+              <w:rPr>
+                <w:lang w:val="en-US"/>
+              </w:rPr>
+              <w:t>3,32</w:t>
+            </w:r>
+          </w:p>
+        </w:tc>
+      </w:tr>
+      <w:tr>
+        <w:tc>
+          <w:tcPr>
+            <w:tcW w:w="3115" w:type="dxa"/>
+          </w:tcPr>
+          <w:p>
+            <w:pPr>
+              <w:pStyle w:val="af8"/>
+              <w:rPr>
+                <w:lang w:val="en-US"/>
+              </w:rPr>
+            </w:pPr>
+            <w:r>
+              <w:rPr>
+                <w:lang w:val="en-US"/>
+              </w:rPr>
+              <w:t>T</w:t>
+            </w:r>
+            <w:r>
+              <w:rPr>
+                <w:vertAlign w:val="subscript"/>
+                <w:lang w:val="en-US"/>
+              </w:rPr>
+              <w:t>20</w:t>
+            </w:r>
+          </w:p>
+        </w:tc>
+        <w:tc>
+          <w:tcPr>
+            <w:tcW w:w="3115" w:type="dxa"/>
+          </w:tcPr>
+          <w:p>
+            <w:pPr>
+              <w:pStyle w:val="af8"/>
+              <w:rPr>
+                <w:lang w:val="en-US"/>
+              </w:rPr>
+            </w:pPr>
+            <w:r>
+              <w:t>0,</w:t>
+            </w:r>
+            <w:r>
+              <w:rPr>
+                <w:lang w:val="en-US"/>
+              </w:rPr>
+              <w:t>88</w:t>
+            </w:r>
+          </w:p>
+        </w:tc>
+        <w:tc>
+          <w:tcPr>
+            <w:tcW w:w="3115" w:type="dxa"/>
+          </w:tcPr>
+          <w:p>
+            <w:pPr>
+              <w:pStyle w:val="af8"/>
+              <w:rPr>
+                <w:lang w:val="en-US"/>
+              </w:rPr>
+            </w:pPr>
+            <w:r>
+              <w:rPr>
+                <w:lang w:val="en-US"/>
+              </w:rPr>
+              <w:t>1,9</w:t>
+            </w:r>
+          </w:p>
+        </w:tc>
+      </w:tr>
+      <w:tr>
+        <w:tc>
+          <w:tcPr>
+            <w:tcW w:w="3115" w:type="dxa"/>
+          </w:tcPr>
+          <w:p>
+            <w:pPr>
+              <w:pStyle w:val="af8"/>
+            </w:pPr>
+            <w:r>
+              <w:rPr>
+                <w:lang w:val="en-US"/>
+              </w:rPr>
+              <w:t>T</w:t>
+            </w:r>
+            <w:r>
+              <w:rPr>
+                <w:vertAlign w:val="subscript"/>
+                <w:lang w:val="en-US"/>
+              </w:rPr>
+              <w:t>30</w:t>
+            </w:r>
+            <w:r>
+              <w:rPr>
+                <w:lang w:val="en-US"/>
+              </w:rPr>
+              <w:t>, T</w:t>
+            </w:r>
+            <w:r>
+              <w:rPr>
+                <w:vertAlign w:val="subscript"/>
+              </w:rPr>
+              <w:t>ОПТ</w:t>
+            </w:r>
+          </w:p>
+        </w:tc>
+        <w:tc>
+          <w:tcPr>
+            <w:tcW w:w="3115" w:type="dxa"/>
+          </w:tcPr>
+          <w:p>
+            <w:pPr>
+              <w:pStyle w:val="af8"/>
+              <w:rPr>
+                <w:lang w:val="en-US"/>
+              </w:rPr>
+            </w:pPr>
+            <w:r>
+              <w:rPr>
+                <w:lang w:val="en-US"/>
+              </w:rPr>
+              <w:t>0,52</w:t>
+            </w:r>
+          </w:p>
+        </w:tc>
+        <w:tc>
+          <w:tcPr>
+            <w:tcW w:w="3115" w:type="dxa"/>
+          </w:tcPr>
+          <w:p>
+            <w:pPr>
+              <w:pStyle w:val="af8"/>
+              <w:rPr>
+                <w:lang w:val="en-US"/>
+              </w:rPr>
+            </w:pPr>
+            <w:r>
+              <w:rPr>
+                <w:lang w:val="en-US"/>
+              </w:rPr>
+              <w:t>1,52</w:t>
+            </w:r>
+          </w:p>
+        </w:tc>
+      </w:tr>
+    </w:tbl>
+    <w:p>
+      <w:pPr>
+        <w:pStyle w:val="af"/>
+        <w:rPr>
+          <w:lang w:val="en-US"/>
+        </w:rPr>
+      </w:pPr>
+    </w:p>
+    <w:p>
+      <w:pPr>
+        <w:pStyle w:val="af"/>
+      </w:pPr>
+      <w:r>
+        <w:t>Результаты расчёта занесём в таб</w:t>
+      </w:r>
+      <w:r>
+        <w:t xml:space="preserve">лицу </w:t>
+      </w:r>
+      <w:r>
+        <w:t>4.</w:t>
+      </w:r>
+    </w:p>
+    <w:p>
+      <w:pPr>
+        <w:pStyle w:val="af6"/>
+        <w:spacing w:line="360" w:lineRule="auto"/>
+        <w:jc w:val="right"/>
+      </w:pPr>
+      <w:r>
+        <w:t>Таблица 4 – Неопределённость измерений раннего времени спада и времён реверберации</w:t>
+      </w:r>
+    </w:p>
+    <w:tbl>
+      <w:tblPr>
+        <w:tblStyle w:val="a6"/>
+        <w:tblW w:w="0" w:type="auto"/>
+        <w:tblLook w:val="04A0" w:firstRow="1" w:lastRow="0" w:firstColumn="1" w:lastColumn="0" w:noHBand="0" w:noVBand="1"/>
+      </w:tblPr>
+      <w:tblGrid>
+        <w:gridCol w:w="4672"/>
+        <w:gridCol w:w="4673"/>
+      </w:tblGrid>
+      <w:tr>
+        <w:tc>
+          <w:tcPr>
+            <w:tcW w:w="4672" w:type="dxa"/>
+          </w:tcPr>
+          <w:p>
+            <w:pPr>
+              <w:pStyle w:val="af6"/>
+            </w:pPr>
+            <w:r>
+              <w:t>Параметр</w:t>
+            </w:r>
+          </w:p>
+        </w:tc>
+        <w:tc>
+          <w:tcPr>
+            <w:tcW w:w="4673" w:type="dxa"/>
+          </w:tcPr>
+          <w:p>
+            <w:pPr>
+              <w:pStyle w:val="af6"/>
+            </w:pPr>
+            <w:r>
+              <w:t>Значение</w:t>
+            </w:r>
+          </w:p>
+        </w:tc>
+      </w:tr>
+      <w:tr>
+        <w:tc>
+          <w:tcPr>
+            <w:tcW w:w="4672" w:type="dxa"/>
+          </w:tcPr>
+          <w:p>
+            <w:pPr>
+              <w:pStyle w:val="af6"/>
+            </w:pPr>
+            <w:r>
+              <w:rPr>
+                <w:lang w:val="en-US"/>
+              </w:rPr>
+              <w:t xml:space="preserve">EDT, </w:t>
+            </w:r>
+            <w:r>
+              <w:t>с</w:t>
+            </w:r>
+          </w:p>
+        </w:tc>
+        <w:tc>
+          <w:tcPr>
+            <w:tcW w:w="4673" w:type="dxa"/>
+          </w:tcPr>
+          <w:p>
+            <w:pPr>
+              <w:pStyle w:val="af6"/>
+            </w:pPr>
+            <w:r>
+              <w:rPr>
+                <w:lang w:val="en-US"/>
+              </w:rPr>
+              <w:t>0,02679</w:t>
+            </w:r>
+          </w:p>
+        </w:tc>
+      </w:tr>
+      <w:tr>
+        <w:tc>
+          <w:tcPr>
+            <w:tcW w:w="4672" w:type="dxa"/>
+          </w:tcPr>
+          <w:p>
+            <w:pPr>
+              <w:pStyle w:val="af6"/>
+            </w:pPr>
+            <w:r>
+              <w:rPr>
+                <w:lang w:val="en-US"/>
+              </w:rPr>
+              <w:t>T</w:t>
+            </w:r>
+            <w:r>
+              <w:rPr>
+                <w:vertAlign w:val="subscript"/>
+                <w:lang w:val="en-US"/>
+              </w:rPr>
+              <w:t>20</w:t>
+            </w:r>
+            <w:r>
+              <w:t>, с</w:t>
+            </w:r>
+          </w:p>
+        </w:tc>
+        <w:tc>
+          <w:tcPr>
+            <w:tcW w:w="4673" w:type="dxa"/>
+          </w:tcPr>
+          <w:p>
+            <w:pPr>
+              <w:pStyle w:val="af6"/>
+            </w:pPr>
+            <w:r>
+              <w:rPr>
+                <w:lang w:val="en-US"/>
+              </w:rPr>
+              <w:t>0,01269</w:t>
+            </w:r>
+          </w:p>
+        </w:tc>
+      </w:tr>
+      <w:tr>
+        <w:tc>
+          <w:tcPr>
+            <w:tcW w:w="4672" w:type="dxa"/>
+          </w:tcPr>
+          <w:p>
+            <w:pPr>
+              <w:pStyle w:val="af6"/>
+            </w:pPr>
+            <w:r>
+              <w:rPr>
+                <w:lang w:val="en-US"/>
+              </w:rPr>
+              <w:t>T</w:t>
+            </w:r>
+            <w:r>
+              <w:rPr>
+                <w:vertAlign w:val="subscript"/>
+                <w:lang w:val="en-US"/>
+              </w:rPr>
+              <w:t>30</w:t>
+            </w:r>
+            <w:r>
+              <w:t>, с</w:t>
+            </w:r>
+          </w:p>
+        </w:tc>
+        <w:tc>
+          <w:tcPr>
+            <w:tcW w:w="4673" w:type="dxa"/>
+          </w:tcPr>
+          <w:p>
+            <w:pPr>
+              <w:pStyle w:val="af6"/>
+            </w:pPr>
+            <w:r>
+              <w:rPr>
+                <w:lang w:val="en-US"/>
+              </w:rPr>
+              <w:t>0,0075</w:t>
+            </w:r>
+            <w:r>
+              <w:t>8</w:t>
+            </w:r>
+          </w:p>
+        </w:tc>
+      </w:tr>
+      <w:tr>
+        <w:tc>
+          <w:tcPr>
+            <w:tcW w:w="4672" w:type="dxa"/>
+          </w:tcPr>
+          <w:p>
+            <w:pPr>
+              <w:pStyle w:val="af6"/>
+            </w:pPr>
+            <w:r>
+              <w:rPr>
+                <w:lang w:val="en-US"/>
+              </w:rPr>
+              <w:t>T</w:t>
+            </w:r>
+            <w:r>
+              <w:rPr>
+                <w:vertAlign w:val="subscript"/>
+              </w:rPr>
+              <w:t>ОРТ</w:t>
+            </w:r>
+            <w:r>
+              <w:t>, с</w:t>
+            </w:r>
+          </w:p>
+        </w:tc>
+        <w:tc>
+          <w:tcPr>
+            <w:tcW w:w="4673" w:type="dxa"/>
+          </w:tcPr>
+          <w:p>
+            <w:pPr>
+              <w:pStyle w:val="af6"/>
+            </w:pPr>
+            <w:r>
+              <w:rPr>
+                <w:lang w:val="en-US"/>
+              </w:rPr>
+              <w:t>0,0076</w:t>
+            </w:r>
+            <w:r>
+              <w:t>2</w:t>
+            </w:r>
+          </w:p>
+        </w:tc>
+      </w:tr>
+    </w:tbl>
+    <w:p>
+      <w:pPr>
+        <w:pStyle w:val="af"/>
+      </w:pPr>
+    </w:p>
+    <w:p>
+      <w:pPr>
+        <w:rPr>
+          <w:rFonts w:eastAsiaTheme="minorHAnsi" w:cstheme="minorBidi"/>
+          <w:kern w:val="2"/>
+          <w:sz w:val="28"/>
+          <w14:ligatures w14:val="standardContextual"/>
+        </w:rPr>
+      </w:pPr>
+      <w:r>
+        <w:br w:type="page"/>
+      </w:r>
+    </w:p>
+    <w:p>
+      <w:pPr>
+        <w:pStyle w:val="af4"/>
+        <w:ind w:firstLine="0"/>
+        <w:jc w:val="center"/>
+        <w:outlineLvl w:val="0"/>
+        <w:rPr>
+          <w:rFonts w:eastAsiaTheme="minorEastAsia"/>
+          <w:sz w:val="32"/>
+          <w:szCs w:val="32"/>
+        </w:rPr>
+      </w:pPr>
+      <w:bookmarkStart w:id="9" w:name="_Toc219186189"/>
+      <w:r>
+        <w:rPr>
+          <w:rFonts w:eastAsiaTheme="minorEastAsia"/>
+          <w:sz w:val="32"/>
+          <w:szCs w:val="32"/>
+        </w:rPr>
+        <w:lastRenderedPageBreak/>
+        <w:t xml:space="preserve">3 </w:t>
+      </w:r>
+      <w:r>
+        <w:rPr>
+          <w:rFonts w:eastAsiaTheme="minorEastAsia"/>
+          <w:sz w:val="32"/>
+          <w:szCs w:val="32"/>
+        </w:rPr>
+        <w:t>Анализ результатов измерений</w:t>
+      </w:r>
+      <w:bookmarkEnd w:id="9"/>
+    </w:p>
+    <w:p>
+      <w:pPr>
+        <w:pStyle w:val="af"/>
+      </w:pPr>
+    </w:p>
+    <w:p>
+      <w:pPr>
+        <w:pStyle w:val="af"/>
+      </w:pPr>
+      <w:r>
+        <w:t>Проанализиру</w:t>
       </w:r>
       <w:r>
         <w:t>ем</w:t>
       </w:r>
       <w:r>
-        <w:t xml:space="preserve"> реверберации явля</w:t>
-      </w:r>
-      <w:r>
-        <w:t>е</w:t>
-      </w:r>
-      <w:r>
-        <w:t xml:space="preserve">тся: </w:t>
-      </w:r>
-      <w:r>
-        <w:rPr>
-          <w:lang w:val="en-US"/>
-        </w:rPr>
-        <w:t>T</w:t>
-      </w:r>
-      <w:r>
-        <w:t xml:space="preserve">30 </w:t>
-      </w:r>
-      <w:r>
-        <w:t>на 1000 Гц.</w:t>
-      </w:r>
-    </w:p>
-    <w:p>
-      <w:pPr>
-        <w:pStyle w:val="af"/>
-      </w:pPr>
-      <w:r>
-        <w:t>На графике</w:t>
-      </w:r>
-      <w:r>
-        <w:t xml:space="preserve"> </w:t>
-      </w:r>
-      <w:r>
-        <w:rPr>
-          <w:lang w:val="en-US"/>
-        </w:rPr>
-        <w:t>S</w:t>
-      </w:r>
-      <w:r>
-        <w:t>0</w:t>
-      </w:r>
-      <w:r>
-        <w:t>2</w:t>
-      </w:r>
-      <w:r>
-        <w:t>_</w:t>
-      </w:r>
-      <w:r>
-        <w:rPr>
-          <w:lang w:val="en-US"/>
-        </w:rPr>
-        <w:t>M</w:t>
-      </w:r>
-      <w:r>
-        <w:t>0</w:t>
-      </w:r>
-      <w:r>
-        <w:t>2 все времена реверберации достоверны.</w:t>
-      </w:r>
-    </w:p>
-    <w:p>
-      <w:pPr>
-        <w:pStyle w:val="af"/>
-      </w:pPr>
-      <w:r>
-        <w:t>На графике</w:t>
-      </w:r>
-      <w:r>
-        <w:t xml:space="preserve"> </w:t>
-      </w:r>
-      <w:r>
-        <w:rPr>
-          <w:lang w:val="en-US"/>
-        </w:rPr>
-        <w:t>S</w:t>
-      </w:r>
-      <w:r>
-        <w:t>0</w:t>
-      </w:r>
-      <w:r>
-        <w:t>2</w:t>
-      </w:r>
-      <w:r>
-        <w:t>_</w:t>
-      </w:r>
-      <w:r>
-        <w:rPr>
-          <w:lang w:val="en-US"/>
-        </w:rPr>
-        <w:t>M</w:t>
-      </w:r>
-      <w:r>
-        <w:t>0</w:t>
-      </w:r>
-      <w:r>
-        <w:t>3 недостоверным времен</w:t>
-      </w:r>
-      <w:r>
-        <w:t>ем</w:t>
-      </w:r>
-      <w:r>
-        <w:t xml:space="preserve"> реверберации явля</w:t>
-      </w:r>
-      <w:r>
-        <w:t>е</w:t>
-      </w:r>
-      <w:r>
-        <w:t xml:space="preserve">тся: </w:t>
-      </w:r>
-      <w:r>
-        <w:rPr>
-          <w:lang w:val="en-US"/>
-        </w:rPr>
-        <w:t>T</w:t>
-      </w:r>
-      <w:r>
-        <w:t>2</w:t>
-      </w:r>
-      <w:r>
-        <w:t xml:space="preserve">0 </w:t>
-      </w:r>
-      <w:r>
-        <w:t>на 125 Гц.</w:t>
-      </w:r>
-    </w:p>
-    <w:p>
-      <w:pPr>
-        <w:pStyle w:val="af"/>
-      </w:pPr>
-      <w:r>
-        <w:t>На графике</w:t>
-      </w:r>
-      <w:r>
-        <w:t xml:space="preserve"> </w:t>
-      </w:r>
-      <w:r>
-        <w:rPr>
-          <w:lang w:val="en-US"/>
-        </w:rPr>
-        <w:t>S</w:t>
-      </w:r>
-      <w:r>
-        <w:t>0</w:t>
-      </w:r>
-      <w:r>
-        <w:t>2</w:t>
-      </w:r>
-      <w:r>
-        <w:t>_</w:t>
-      </w:r>
-      <w:r>
-        <w:rPr>
-          <w:lang w:val="en-US"/>
-        </w:rPr>
-        <w:t>M</w:t>
-      </w:r>
-      <w:r>
-        <w:t>0</w:t>
-      </w:r>
-      <w:r>
-        <w:t>4 все времена реверберации достоверны.</w:t>
-      </w:r>
-    </w:p>
-    <w:p>
-      <w:pPr>
-        <w:pStyle w:val="af"/>
-      </w:pPr>
-      <w:r>
-        <w:t>Сохраним текстовый файл, в котором будут значения частотных зависимостей акустических параметров помещения.</w:t>
-      </w:r>
-    </w:p>
-    <w:p>
-      <w:pPr>
-        <w:pStyle w:val="af"/>
-      </w:pPr>
+        <w:t xml:space="preserve"> полученные результаты измерений акустических параметров помещения</w:t>
+      </w:r>
+      <w:r>
+        <w:t>:</w:t>
+      </w:r>
+    </w:p>
+    <w:p>
+      <w:pPr>
+        <w:pStyle w:val="af"/>
+      </w:pPr>
+    </w:p>
+    <w:p>
+      <w:pPr>
+        <w:pStyle w:val="af"/>
+      </w:pPr>
+      <w:r>
+        <w:t>1) Насколько отличаются друг от друга оцененные значения времени реверберации TOPT, T20, T30? О чем свидетельствует наличие (отсутствие) отличий? Какая оценка, по Вашему мнению, должна быть признана наиболее достоверной?</w:t>
+      </w:r>
+    </w:p>
+    <w:p>
+      <w:pPr>
+        <w:pStyle w:val="af"/>
+      </w:pPr>
+      <w:r>
+        <w:t>Значения TOPT, T20 и T30 оказались близкими между собой, что говорит о том, что спад звукового давления в помещении происходит почти по экспоненциальному закону — без резких скачков или аномалий. Это также указывает на достаточно диффузное звуковое поле и корректность проведённых измерений. Наиболее надёжной считается оценка T30, поскольку она рассчитывается по самому длинному участку затухания (от –5 до –35 дБ), что снижает влияние случайных погрешностей и фоновых шумов.</w:t>
+      </w:r>
+    </w:p>
+    <w:p>
+      <w:pPr>
+        <w:pStyle w:val="af"/>
+      </w:pPr>
+      <w:r>
+        <w:t>2) Насколько отличается от времени реверберации TOPT измеренное значение раннего времени спада EDT? О чем свидетельствует наличие (отсутствие) отличий? Как наличие (отсутствие) отличий характеризует акустическое качество исследуемого помещения?</w:t>
+      </w:r>
+    </w:p>
+    <w:p>
+      <w:pPr>
+        <w:pStyle w:val="af"/>
+      </w:pPr>
+      <w:r>
+        <w:t xml:space="preserve">Раннее время спада оказалось примерно на 10 % меньше, чем TOPT. Это означает, что начальная часть звукового сигнала затухает быстрее, что обычно связано с эффективным поглощением или рассеиванием первых отражений. Такое соотношение воспринимается на слух как «чёткое» и «сухое» звучание, что благоприятно для разборчивости речи. Подобные характеристики считаются признаком хорошего акустического качества, особенно </w:t>
+      </w:r>
+      <w:r>
+        <w:br/>
+      </w:r>
+      <w:r>
+        <w:t>в помещениях, предназначенных для лекций, конференций или студийной записи.</w:t>
+      </w:r>
+    </w:p>
+    <w:p>
+      <w:pPr>
+        <w:pStyle w:val="af"/>
+      </w:pPr>
+      <w:r>
+        <w:t xml:space="preserve">3) Как измеренное значения времени реверберации характеризуют акустическое качество исследуемого помещения при воспроизведении в нем: </w:t>
+      </w:r>
+      <w:r>
+        <w:lastRenderedPageBreak/>
+        <w:t>речевого сигнала, музыкального сигнала? Соответствует ли измеренное значение времени реверберации оптимальному значению для воспроизведения: речевого сигнала, музыкального сигнала?</w:t>
+      </w:r>
+    </w:p>
+    <w:p>
+      <w:pPr>
+        <w:pStyle w:val="af"/>
+      </w:pPr>
+      <w:r>
+        <w:t xml:space="preserve">Среднее время реверберации около 1 секунды находится на верхней границе рекомендуемого диапазона для речевых задач (0,6–1,0 с), что обеспечивает хорошую разборчивость, хотя в больших помещениях может немного снижаться ощущение «сухости». Для музыки это значение минимально допустимо: оно подходит для жанров, где важна чёткость </w:t>
+      </w:r>
+      <w:r>
+        <w:br/>
+      </w:r>
+      <w:r>
+        <w:t>и детализация (например, джаз или камерная музыка), но может показаться слишком «сухим» для классической или органной музыки, где желательна более выраженная реверберация. Таким образом, помещение лучше всего подходит для речевых и студийных задач.</w:t>
+      </w:r>
+    </w:p>
+    <w:p>
+      <w:pPr>
+        <w:pStyle w:val="af"/>
+      </w:pPr>
+      <w:r>
+        <w:t xml:space="preserve">4) Как полученные значения параметров четкости (D50, С50) </w:t>
+      </w:r>
+      <w:r>
+        <w:br/>
+      </w:r>
+      <w:r>
+        <w:t>и центрального момента времени TS характеризуют ожидаемую разборчивость речи при воспроизведении в исследуемом помещении речевого сигнала?</w:t>
+      </w:r>
+    </w:p>
+    <w:p>
+      <w:pPr>
+        <w:pStyle w:val="af"/>
+      </w:pPr>
+      <w:r>
+        <w:t>Показатели говорят о высокой разборчивости речи:</w:t>
+      </w:r>
+    </w:p>
+    <w:p>
+      <w:pPr>
+        <w:pStyle w:val="af"/>
+        <w:numPr>
+          <w:ilvl w:val="0"/>
+          <w:numId w:val="10"/>
+        </w:numPr>
+      </w:pPr>
+      <w:r>
+        <w:t>D50 превышает 50 %, то есть большая часть звуковой энергии поступает к слушателю в первые 50 мс — это критически важно для распознавания слогов;</w:t>
+      </w:r>
+    </w:p>
+    <w:p>
+      <w:pPr>
+        <w:pStyle w:val="af"/>
+        <w:numPr>
+          <w:ilvl w:val="0"/>
+          <w:numId w:val="10"/>
+        </w:numPr>
+      </w:pPr>
+      <w:r>
+        <w:t>C50 положителен и превышает 2 дБ, что означает явное преобладание полезных ранних отражений над поздней реверберацией;</w:t>
+      </w:r>
+    </w:p>
+    <w:p>
+      <w:pPr>
+        <w:pStyle w:val="af"/>
+        <w:numPr>
+          <w:ilvl w:val="0"/>
+          <w:numId w:val="10"/>
+        </w:numPr>
+      </w:pPr>
+      <w:r>
+        <w:t>Центральный момент времени TS составляет всего 58 мс, что свидетельствует о концентрации энергии в начале импульсной характеристики и минимизирует «перезвон» между слогами.</w:t>
+      </w:r>
+    </w:p>
+    <w:p>
+      <w:pPr>
+        <w:pStyle w:val="af"/>
+      </w:pPr>
+      <w:r>
+        <w:t xml:space="preserve">В совокупности эти параметры </w:t>
+      </w:r>
+      <w:r>
+        <w:t>характеризуют</w:t>
+      </w:r>
+      <w:r>
+        <w:t xml:space="preserve"> отличную понятность речи в данном помещении.</w:t>
+      </w:r>
+    </w:p>
+    <w:p>
+      <w:pPr>
+        <w:pStyle w:val="af"/>
+      </w:pPr>
+      <w:r>
+        <w:t>5) Как полученные значения индекса С80 и центрального момента времени TS характеризуют ожидаемую ясность, прозрачность при воспроизведении в исследуемом помещении музыкального сигнала?</w:t>
+      </w:r>
+    </w:p>
+    <w:p>
+      <w:pPr>
+        <w:pStyle w:val="af"/>
+      </w:pPr>
+      <w:r>
+        <w:lastRenderedPageBreak/>
+        <w:t xml:space="preserve">Высокое значение C80 и низкий TS указывают на высокую музыкальную чёткость: быстро следующие звуки будут восприниматься чётко и раздельно. Однако такое акустическое поведение может создавать ощущение «сухости» </w:t>
+      </w:r>
+      <w:r>
+        <w:br/>
+      </w:r>
+      <w:r>
+        <w:t>и недостатка пространственного объёма, что типично для студий или репетиционных залов, но не для концертных площадок, где важна атмосфера и «теплота» звучания.</w:t>
+      </w:r>
+    </w:p>
+    <w:p>
+      <w:pPr>
+        <w:pStyle w:val="af"/>
+      </w:pPr>
+      <w:r>
+        <w:t>6) Какое влияние на результаты измерений оказывают технические характеристики оборудования, используемого при проведении измерений?</w:t>
+      </w:r>
+    </w:p>
+    <w:p>
+      <w:pPr>
+        <w:pStyle w:val="af"/>
+      </w:pPr>
+      <w:r>
+        <w:t>Качество измерительного оборудования напрямую влияет на точность результатов:</w:t>
+      </w:r>
+    </w:p>
+    <w:p>
+      <w:pPr>
+        <w:pStyle w:val="af"/>
+        <w:numPr>
+          <w:ilvl w:val="0"/>
+          <w:numId w:val="11"/>
+        </w:numPr>
+      </w:pPr>
+      <w:r>
+        <w:t>Неравномерная АЧХ микрофона, особенно на крайних частотах, искажает спектральные оценки параметров;</w:t>
+      </w:r>
+    </w:p>
+    <w:p>
+      <w:pPr>
+        <w:pStyle w:val="af"/>
+        <w:numPr>
+          <w:ilvl w:val="0"/>
+          <w:numId w:val="11"/>
+        </w:numPr>
+      </w:pPr>
+      <w:r>
+        <w:t xml:space="preserve">Ограниченный динамический диапазон АЦП/ЦАП и усилителей не позволяет точно зафиксировать весь спад импульсной характеристики, особенно в низкочастотной области, что делает данные по T30 </w:t>
+      </w:r>
+      <w:r>
+        <w:br/>
+      </w:r>
+      <w:r>
+        <w:t>и энергетическим параметрам (C50, D50, TS) менее надёжными;</w:t>
+      </w:r>
+    </w:p>
+    <w:p>
+      <w:pPr>
+        <w:pStyle w:val="af"/>
+        <w:numPr>
+          <w:ilvl w:val="0"/>
+          <w:numId w:val="11"/>
+        </w:numPr>
+      </w:pPr>
+      <w:r>
+        <w:t>Неточная калибровка уровней приводит к систематическим ошибкам во всех измерениях;</w:t>
+      </w:r>
+    </w:p>
+    <w:p>
+      <w:pPr>
+        <w:pStyle w:val="af"/>
+        <w:numPr>
+          <w:ilvl w:val="0"/>
+          <w:numId w:val="11"/>
+        </w:numPr>
+      </w:pPr>
+      <w:r>
+        <w:t>Различия в алгоритмах обработки сигнала в программном обеспечении могут давать небольшие расхождения, особенно при низком отношении сигнал/шум.</w:t>
+      </w:r>
+    </w:p>
+    <w:p>
+      <w:pPr>
+        <w:pStyle w:val="af"/>
+      </w:pPr>
+      <w:r>
+        <w:t xml:space="preserve">Таким образом, основным источником погрешностей является ограниченный динамический диапазон аппаратуры, особенно критичный </w:t>
+      </w:r>
+      <w:r>
+        <w:br/>
+      </w:r>
+      <w:r>
+        <w:t>в НЧ-диапазоне.</w:t>
+      </w:r>
     </w:p>
     <w:p>
       <w:pPr>
@@ -4057,6 +6485,155 @@
     </w:lvl>
   </w:abstractNum>
   <w:abstractNum w:abstractNumId="1" w15:restartNumberingAfterBreak="0">
+    <w:nsid w:val="13D16F0F"/>
+    <w:multiLevelType w:val="multilevel"/>
+    <w:tmpl w:val="B63E06F0"/>
+    <w:lvl w:ilvl="0">
+      <w:start w:val="1"/>
+      <w:numFmt w:val="bullet"/>
+      <w:lvlText w:val=""/>
+      <w:lvlJc w:val="left"/>
+      <w:pPr>
+        <w:tabs>
+          <w:tab w:val="num" w:pos="720"/>
+        </w:tabs>
+        <w:ind w:left="720" w:hanging="360"/>
+      </w:pPr>
+      <w:rPr>
+        <w:rFonts w:ascii="Symbol" w:hAnsi="Symbol" w:hint="default"/>
+        <w:sz w:val="20"/>
+      </w:rPr>
+    </w:lvl>
+    <w:lvl w:ilvl="1" w:tentative="1">
+      <w:start w:val="1"/>
+      <w:numFmt w:val="bullet"/>
+      <w:lvlText w:val="o"/>
+      <w:lvlJc w:val="left"/>
+      <w:pPr>
+        <w:tabs>
+          <w:tab w:val="num" w:pos="1440"/>
+        </w:tabs>
+        <w:ind w:left="1440" w:hanging="360"/>
+      </w:pPr>
+      <w:rPr>
+        <w:rFonts w:ascii="Courier New" w:hAnsi="Courier New" w:hint="default"/>
+        <w:sz w:val="20"/>
+      </w:rPr>
+    </w:lvl>
+    <w:lvl w:ilvl="2" w:tentative="1">
+      <w:start w:val="1"/>
+      <w:numFmt w:val="bullet"/>
+      <w:lvlText w:val=""/>
+      <w:lvlJc w:val="left"/>
+      <w:pPr>
+        <w:tabs>
+          <w:tab w:val="num" w:pos="2160"/>
+        </w:tabs>
+        <w:ind w:left="2160" w:hanging="360"/>
+      </w:pPr>
+      <w:rPr>
+        <w:rFonts w:ascii="Wingdings" w:hAnsi="Wingdings" w:hint="default"/>
+        <w:sz w:val="20"/>
+      </w:rPr>
+    </w:lvl>
+    <w:lvl w:ilvl="3" w:tentative="1">
+      <w:start w:val="1"/>
+      <w:numFmt w:val="bullet"/>
+      <w:lvlText w:val=""/>
+      <w:lvlJc w:val="left"/>
+      <w:pPr>
+        <w:tabs>
+          <w:tab w:val="num" w:pos="2880"/>
+        </w:tabs>
+        <w:ind w:left="2880" w:hanging="360"/>
+      </w:pPr>
+      <w:rPr>
+        <w:rFonts w:ascii="Wingdings" w:hAnsi="Wingdings" w:hint="default"/>
+        <w:sz w:val="20"/>
+      </w:rPr>
+    </w:lvl>
+    <w:lvl w:ilvl="4" w:tentative="1">
+      <w:start w:val="1"/>
+      <w:numFmt w:val="bullet"/>
+      <w:lvlText w:val=""/>
+      <w:lvlJc w:val="left"/>
+      <w:pPr>
+        <w:tabs>
+          <w:tab w:val="num" w:pos="3600"/>
+        </w:tabs>
+        <w:ind w:left="3600" w:hanging="360"/>
+      </w:pPr>
+      <w:rPr>
+        <w:rFonts w:ascii="Wingdings" w:hAnsi="Wingdings" w:hint="default"/>
+        <w:sz w:val="20"/>
+      </w:rPr>
+    </w:lvl>
+    <w:lvl w:ilvl="5" w:tentative="1">
+      <w:start w:val="1"/>
+      <w:numFmt w:val="bullet"/>
+      <w:lvlText w:val=""/>
+      <w:lvlJc w:val="left"/>
+      <w:pPr>
+        <w:tabs>
+          <w:tab w:val="num" w:pos="4320"/>
+        </w:tabs>
+        <w:ind w:left="4320" w:hanging="360"/>
+      </w:pPr>
+      <w:rPr>
+        <w:rFonts w:ascii="Wingdings" w:hAnsi="Wingdings" w:hint="default"/>
+        <w:sz w:val="20"/>
+      </w:rPr>
+    </w:lvl>
+    <w:lvl w:ilvl="6" w:tentative="1">
+      <w:start w:val="1"/>
+      <w:numFmt w:val="bullet"/>
+      <w:lvlText w:val=""/>
+      <w:lvlJc w:val="left"/>
+      <w:pPr>
+        <w:tabs>
+          <w:tab w:val="num" w:pos="5040"/>
+        </w:tabs>
+        <w:ind w:left="5040" w:hanging="360"/>
+      </w:pPr>
+      <w:rPr>
+        <w:rFonts w:ascii="Wingdings" w:hAnsi="Wingdings" w:hint="default"/>
+        <w:sz w:val="20"/>
+      </w:rPr>
+    </w:lvl>
+    <w:lvl w:ilvl="7" w:tentative="1">
+      <w:start w:val="1"/>
+      <w:numFmt w:val="bullet"/>
+      <w:lvlText w:val=""/>
+      <w:lvlJc w:val="left"/>
+      <w:pPr>
+        <w:tabs>
+          <w:tab w:val="num" w:pos="5760"/>
+        </w:tabs>
+        <w:ind w:left="5760" w:hanging="360"/>
+      </w:pPr>
+      <w:rPr>
+        <w:rFonts w:ascii="Wingdings" w:hAnsi="Wingdings" w:hint="default"/>
+        <w:sz w:val="20"/>
+      </w:rPr>
+    </w:lvl>
+    <w:lvl w:ilvl="8" w:tentative="1">
+      <w:start w:val="1"/>
+      <w:numFmt w:val="bullet"/>
+      <w:lvlText w:val=""/>
+      <w:lvlJc w:val="left"/>
+      <w:pPr>
+        <w:tabs>
+          <w:tab w:val="num" w:pos="6480"/>
+        </w:tabs>
+        <w:ind w:left="6480" w:hanging="360"/>
+      </w:pPr>
+      <w:rPr>
+        <w:rFonts w:ascii="Wingdings" w:hAnsi="Wingdings" w:hint="default"/>
+        <w:sz w:val="20"/>
+      </w:rPr>
+    </w:lvl>
+  </w:abstractNum>
+  <w:abstractNum w:abstractNumId="2" w15:restartNumberingAfterBreak="0">
     <w:nsid w:val="1C9B0B60"/>
     <w:multiLevelType w:val="multilevel"/>
     <w:tmpl w:val="37067040"/>
@@ -4205,7 +6782,156 @@
       </w:rPr>
     </w:lvl>
   </w:abstractNum>
-  <w:abstractNum w:abstractNumId="2" w15:restartNumberingAfterBreak="0">
+  <w:abstractNum w:abstractNumId="3" w15:restartNumberingAfterBreak="0">
+    <w:nsid w:val="38443A95"/>
+    <w:multiLevelType w:val="multilevel"/>
+    <w:tmpl w:val="53CACDC6"/>
+    <w:lvl w:ilvl="0">
+      <w:start w:val="1"/>
+      <w:numFmt w:val="bullet"/>
+      <w:lvlText w:val=""/>
+      <w:lvlJc w:val="left"/>
+      <w:pPr>
+        <w:tabs>
+          <w:tab w:val="num" w:pos="720"/>
+        </w:tabs>
+        <w:ind w:left="720" w:hanging="360"/>
+      </w:pPr>
+      <w:rPr>
+        <w:rFonts w:ascii="Symbol" w:hAnsi="Symbol" w:hint="default"/>
+        <w:sz w:val="20"/>
+      </w:rPr>
+    </w:lvl>
+    <w:lvl w:ilvl="1" w:tentative="1">
+      <w:start w:val="1"/>
+      <w:numFmt w:val="bullet"/>
+      <w:lvlText w:val="o"/>
+      <w:lvlJc w:val="left"/>
+      <w:pPr>
+        <w:tabs>
+          <w:tab w:val="num" w:pos="1440"/>
+        </w:tabs>
+        <w:ind w:left="1440" w:hanging="360"/>
+      </w:pPr>
+      <w:rPr>
+        <w:rFonts w:ascii="Courier New" w:hAnsi="Courier New" w:hint="default"/>
+        <w:sz w:val="20"/>
+      </w:rPr>
+    </w:lvl>
+    <w:lvl w:ilvl="2" w:tentative="1">
+      <w:start w:val="1"/>
+      <w:numFmt w:val="bullet"/>
+      <w:lvlText w:val=""/>
+      <w:lvlJc w:val="left"/>
+      <w:pPr>
+        <w:tabs>
+          <w:tab w:val="num" w:pos="2160"/>
+        </w:tabs>
+        <w:ind w:left="2160" w:hanging="360"/>
+      </w:pPr>
+      <w:rPr>
+        <w:rFonts w:ascii="Wingdings" w:hAnsi="Wingdings" w:hint="default"/>
+        <w:sz w:val="20"/>
+      </w:rPr>
+    </w:lvl>
+    <w:lvl w:ilvl="3" w:tentative="1">
+      <w:start w:val="1"/>
+      <w:numFmt w:val="bullet"/>
+      <w:lvlText w:val=""/>
+      <w:lvlJc w:val="left"/>
+      <w:pPr>
+        <w:tabs>
+          <w:tab w:val="num" w:pos="2880"/>
+        </w:tabs>
+        <w:ind w:left="2880" w:hanging="360"/>
+      </w:pPr>
+      <w:rPr>
+        <w:rFonts w:ascii="Wingdings" w:hAnsi="Wingdings" w:hint="default"/>
+        <w:sz w:val="20"/>
+      </w:rPr>
+    </w:lvl>
+    <w:lvl w:ilvl="4" w:tentative="1">
+      <w:start w:val="1"/>
+      <w:numFmt w:val="bullet"/>
+      <w:lvlText w:val=""/>
+      <w:lvlJc w:val="left"/>
+      <w:pPr>
+        <w:tabs>
+          <w:tab w:val="num" w:pos="3600"/>
+        </w:tabs>
+        <w:ind w:left="3600" w:hanging="360"/>
+      </w:pPr>
+      <w:rPr>
+        <w:rFonts w:ascii="Wingdings" w:hAnsi="Wingdings" w:hint="default"/>
+        <w:sz w:val="20"/>
+      </w:rPr>
+    </w:lvl>
+    <w:lvl w:ilvl="5" w:tentative="1">
+      <w:start w:val="1"/>
+      <w:numFmt w:val="bullet"/>
+      <w:lvlText w:val=""/>
+      <w:lvlJc w:val="left"/>
+      <w:pPr>
+        <w:tabs>
+          <w:tab w:val="num" w:pos="4320"/>
+        </w:tabs>
+        <w:ind w:left="4320" w:hanging="360"/>
+      </w:pPr>
+      <w:rPr>
+        <w:rFonts w:ascii="Wingdings" w:hAnsi="Wingdings" w:hint="default"/>
+        <w:sz w:val="20"/>
+      </w:rPr>
+    </w:lvl>
+    <w:lvl w:ilvl="6" w:tentative="1">
+      <w:start w:val="1"/>
+      <w:numFmt w:val="bullet"/>
+      <w:lvlText w:val=""/>
+      <w:lvlJc w:val="left"/>
+      <w:pPr>
+        <w:tabs>
+          <w:tab w:val="num" w:pos="5040"/>
+        </w:tabs>
+        <w:ind w:left="5040" w:hanging="360"/>
+      </w:pPr>
+      <w:rPr>
+        <w:rFonts w:ascii="Wingdings" w:hAnsi="Wingdings" w:hint="default"/>
+        <w:sz w:val="20"/>
+      </w:rPr>
+    </w:lvl>
+    <w:lvl w:ilvl="7" w:tentative="1">
+      <w:start w:val="1"/>
+      <w:numFmt w:val="bullet"/>
+      <w:lvlText w:val=""/>
+      <w:lvlJc w:val="left"/>
+      <w:pPr>
+        <w:tabs>
+          <w:tab w:val="num" w:pos="5760"/>
+        </w:tabs>
+        <w:ind w:left="5760" w:hanging="360"/>
+      </w:pPr>
+      <w:rPr>
+        <w:rFonts w:ascii="Wingdings" w:hAnsi="Wingdings" w:hint="default"/>
+        <w:sz w:val="20"/>
+      </w:rPr>
+    </w:lvl>
+    <w:lvl w:ilvl="8" w:tentative="1">
+      <w:start w:val="1"/>
+      <w:numFmt w:val="bullet"/>
+      <w:lvlText w:val=""/>
+      <w:lvlJc w:val="left"/>
+      <w:pPr>
+        <w:tabs>
+          <w:tab w:val="num" w:pos="6480"/>
+        </w:tabs>
+        <w:ind w:left="6480" w:hanging="360"/>
+      </w:pPr>
+      <w:rPr>
+        <w:rFonts w:ascii="Wingdings" w:hAnsi="Wingdings" w:hint="default"/>
+        <w:sz w:val="20"/>
+      </w:rPr>
+    </w:lvl>
+  </w:abstractNum>
+  <w:abstractNum w:abstractNumId="4" w15:restartNumberingAfterBreak="0">
     <w:nsid w:val="3F847976"/>
     <w:multiLevelType w:val="hybridMultilevel"/>
     <w:tmpl w:val="9558C788"/>
@@ -4327,7 +7053,7 @@
       </w:rPr>
     </w:lvl>
   </w:abstractNum>
-  <w:abstractNum w:abstractNumId="3" w15:restartNumberingAfterBreak="0">
+  <w:abstractNum w:abstractNumId="5" w15:restartNumberingAfterBreak="0">
     <w:nsid w:val="4074600E"/>
     <w:multiLevelType w:val="hybridMultilevel"/>
     <w:tmpl w:val="FEFA870E"/>
@@ -4440,7 +7166,7 @@
       </w:rPr>
     </w:lvl>
   </w:abstractNum>
-  <w:abstractNum w:abstractNumId="4" w15:restartNumberingAfterBreak="0">
+  <w:abstractNum w:abstractNumId="6" w15:restartNumberingAfterBreak="0">
     <w:nsid w:val="4D2A1852"/>
     <w:multiLevelType w:val="hybridMultilevel"/>
     <w:tmpl w:val="46662350"/>
@@ -4529,7 +7255,7 @@
       </w:pPr>
     </w:lvl>
   </w:abstractNum>
-  <w:abstractNum w:abstractNumId="5" w15:restartNumberingAfterBreak="0">
+  <w:abstractNum w:abstractNumId="7" w15:restartNumberingAfterBreak="0">
     <w:nsid w:val="66406B10"/>
     <w:multiLevelType w:val="multilevel"/>
     <w:tmpl w:val="20EEC754"/>
@@ -4653,7 +7379,156 @@
       </w:rPr>
     </w:lvl>
   </w:abstractNum>
-  <w:abstractNum w:abstractNumId="6" w15:restartNumberingAfterBreak="0">
+  <w:abstractNum w:abstractNumId="8" w15:restartNumberingAfterBreak="0">
+    <w:nsid w:val="6CCB0683"/>
+    <w:multiLevelType w:val="multilevel"/>
+    <w:tmpl w:val="12BC10F6"/>
+    <w:lvl w:ilvl="0">
+      <w:start w:val="1"/>
+      <w:numFmt w:val="bullet"/>
+      <w:lvlText w:val=""/>
+      <w:lvlJc w:val="left"/>
+      <w:pPr>
+        <w:tabs>
+          <w:tab w:val="num" w:pos="720"/>
+        </w:tabs>
+        <w:ind w:left="720" w:hanging="360"/>
+      </w:pPr>
+      <w:rPr>
+        <w:rFonts w:ascii="Symbol" w:hAnsi="Symbol" w:hint="default"/>
+        <w:sz w:val="20"/>
+      </w:rPr>
+    </w:lvl>
+    <w:lvl w:ilvl="1" w:tentative="1">
+      <w:start w:val="1"/>
+      <w:numFmt w:val="bullet"/>
+      <w:lvlText w:val="o"/>
+      <w:lvlJc w:val="left"/>
+      <w:pPr>
+        <w:tabs>
+          <w:tab w:val="num" w:pos="1440"/>
+        </w:tabs>
+        <w:ind w:left="1440" w:hanging="360"/>
+      </w:pPr>
+      <w:rPr>
+        <w:rFonts w:ascii="Courier New" w:hAnsi="Courier New" w:hint="default"/>
+        <w:sz w:val="20"/>
+      </w:rPr>
+    </w:lvl>
+    <w:lvl w:ilvl="2" w:tentative="1">
+      <w:start w:val="1"/>
+      <w:numFmt w:val="bullet"/>
+      <w:lvlText w:val=""/>
+      <w:lvlJc w:val="left"/>
+      <w:pPr>
+        <w:tabs>
+          <w:tab w:val="num" w:pos="2160"/>
+        </w:tabs>
+        <w:ind w:left="2160" w:hanging="360"/>
+      </w:pPr>
+      <w:rPr>
+        <w:rFonts w:ascii="Wingdings" w:hAnsi="Wingdings" w:hint="default"/>
+        <w:sz w:val="20"/>
+      </w:rPr>
+    </w:lvl>
+    <w:lvl w:ilvl="3" w:tentative="1">
+      <w:start w:val="1"/>
+      <w:numFmt w:val="bullet"/>
+      <w:lvlText w:val=""/>
+      <w:lvlJc w:val="left"/>
+      <w:pPr>
+        <w:tabs>
+          <w:tab w:val="num" w:pos="2880"/>
+        </w:tabs>
+        <w:ind w:left="2880" w:hanging="360"/>
+      </w:pPr>
+      <w:rPr>
+        <w:rFonts w:ascii="Wingdings" w:hAnsi="Wingdings" w:hint="default"/>
+        <w:sz w:val="20"/>
+      </w:rPr>
+    </w:lvl>
+    <w:lvl w:ilvl="4" w:tentative="1">
+      <w:start w:val="1"/>
+      <w:numFmt w:val="bullet"/>
+      <w:lvlText w:val=""/>
+      <w:lvlJc w:val="left"/>
+      <w:pPr>
+        <w:tabs>
+          <w:tab w:val="num" w:pos="3600"/>
+        </w:tabs>
+        <w:ind w:left="3600" w:hanging="360"/>
+      </w:pPr>
+      <w:rPr>
+        <w:rFonts w:ascii="Wingdings" w:hAnsi="Wingdings" w:hint="default"/>
+        <w:sz w:val="20"/>
+      </w:rPr>
+    </w:lvl>
+    <w:lvl w:ilvl="5" w:tentative="1">
+      <w:start w:val="1"/>
+      <w:numFmt w:val="bullet"/>
+      <w:lvlText w:val=""/>
+      <w:lvlJc w:val="left"/>
+      <w:pPr>
+        <w:tabs>
+          <w:tab w:val="num" w:pos="4320"/>
+        </w:tabs>
+        <w:ind w:left="4320" w:hanging="360"/>
+      </w:pPr>
+      <w:rPr>
+        <w:rFonts w:ascii="Wingdings" w:hAnsi="Wingdings" w:hint="default"/>
+        <w:sz w:val="20"/>
+      </w:rPr>
+    </w:lvl>
+    <w:lvl w:ilvl="6" w:tentative="1">
+      <w:start w:val="1"/>
+      <w:numFmt w:val="bullet"/>
+      <w:lvlText w:val=""/>
+      <w:lvlJc w:val="left"/>
+      <w:pPr>
+        <w:tabs>
+          <w:tab w:val="num" w:pos="5040"/>
+        </w:tabs>
+        <w:ind w:left="5040" w:hanging="360"/>
+      </w:pPr>
+      <w:rPr>
+        <w:rFonts w:ascii="Wingdings" w:hAnsi="Wingdings" w:hint="default"/>
+        <w:sz w:val="20"/>
+      </w:rPr>
+    </w:lvl>
+    <w:lvl w:ilvl="7" w:tentative="1">
+      <w:start w:val="1"/>
+      <w:numFmt w:val="bullet"/>
+      <w:lvlText w:val=""/>
+      <w:lvlJc w:val="left"/>
+      <w:pPr>
+        <w:tabs>
+          <w:tab w:val="num" w:pos="5760"/>
+        </w:tabs>
+        <w:ind w:left="5760" w:hanging="360"/>
+      </w:pPr>
+      <w:rPr>
+        <w:rFonts w:ascii="Wingdings" w:hAnsi="Wingdings" w:hint="default"/>
+        <w:sz w:val="20"/>
+      </w:rPr>
+    </w:lvl>
+    <w:lvl w:ilvl="8" w:tentative="1">
+      <w:start w:val="1"/>
+      <w:numFmt w:val="bullet"/>
+      <w:lvlText w:val=""/>
+      <w:lvlJc w:val="left"/>
+      <w:pPr>
+        <w:tabs>
+          <w:tab w:val="num" w:pos="6480"/>
+        </w:tabs>
+        <w:ind w:left="6480" w:hanging="360"/>
+      </w:pPr>
+      <w:rPr>
+        <w:rFonts w:ascii="Wingdings" w:hAnsi="Wingdings" w:hint="default"/>
+        <w:sz w:val="20"/>
+      </w:rPr>
+    </w:lvl>
+  </w:abstractNum>
+  <w:abstractNum w:abstractNumId="9" w15:restartNumberingAfterBreak="0">
     <w:nsid w:val="7A0E2BB6"/>
     <w:multiLevelType w:val="hybridMultilevel"/>
     <w:tmpl w:val="2CB8EADE"/>
@@ -4742,26 +7617,187 @@
       </w:pPr>
     </w:lvl>
   </w:abstractNum>
+  <w:abstractNum w:abstractNumId="10" w15:restartNumberingAfterBreak="0">
+    <w:nsid w:val="7CBC01AB"/>
+    <w:multiLevelType w:val="multilevel"/>
+    <w:tmpl w:val="368288A6"/>
+    <w:lvl w:ilvl="0">
+      <w:start w:val="1"/>
+      <w:numFmt w:val="bullet"/>
+      <w:lvlText w:val=""/>
+      <w:lvlJc w:val="left"/>
+      <w:pPr>
+        <w:tabs>
+          <w:tab w:val="num" w:pos="1069"/>
+        </w:tabs>
+        <w:ind w:left="1069" w:hanging="360"/>
+      </w:pPr>
+      <w:rPr>
+        <w:rFonts w:ascii="Symbol" w:hAnsi="Symbol" w:hint="default"/>
+        <w:sz w:val="20"/>
+      </w:rPr>
+    </w:lvl>
+    <w:lvl w:ilvl="1" w:tentative="1">
+      <w:start w:val="1"/>
+      <w:numFmt w:val="bullet"/>
+      <w:lvlText w:val="o"/>
+      <w:lvlJc w:val="left"/>
+      <w:pPr>
+        <w:tabs>
+          <w:tab w:val="num" w:pos="1789"/>
+        </w:tabs>
+        <w:ind w:left="1789" w:hanging="360"/>
+      </w:pPr>
+      <w:rPr>
+        <w:rFonts w:ascii="Courier New" w:hAnsi="Courier New" w:hint="default"/>
+        <w:sz w:val="20"/>
+      </w:rPr>
+    </w:lvl>
+    <w:lvl w:ilvl="2" w:tentative="1">
+      <w:start w:val="1"/>
+      <w:numFmt w:val="bullet"/>
+      <w:lvlText w:val=""/>
+      <w:lvlJc w:val="left"/>
+      <w:pPr>
+        <w:tabs>
+          <w:tab w:val="num" w:pos="2509"/>
+        </w:tabs>
+        <w:ind w:left="2509" w:hanging="360"/>
+      </w:pPr>
+      <w:rPr>
+        <w:rFonts w:ascii="Wingdings" w:hAnsi="Wingdings" w:hint="default"/>
+        <w:sz w:val="20"/>
+      </w:rPr>
+    </w:lvl>
+    <w:lvl w:ilvl="3" w:tentative="1">
+      <w:start w:val="1"/>
+      <w:numFmt w:val="bullet"/>
+      <w:lvlText w:val=""/>
+      <w:lvlJc w:val="left"/>
+      <w:pPr>
+        <w:tabs>
+          <w:tab w:val="num" w:pos="3229"/>
+        </w:tabs>
+        <w:ind w:left="3229" w:hanging="360"/>
+      </w:pPr>
+      <w:rPr>
+        <w:rFonts w:ascii="Wingdings" w:hAnsi="Wingdings" w:hint="default"/>
+        <w:sz w:val="20"/>
+      </w:rPr>
+    </w:lvl>
+    <w:lvl w:ilvl="4" w:tentative="1">
+      <w:start w:val="1"/>
+      <w:numFmt w:val="bullet"/>
+      <w:lvlText w:val=""/>
+      <w:lvlJc w:val="left"/>
+      <w:pPr>
+        <w:tabs>
+          <w:tab w:val="num" w:pos="3949"/>
+        </w:tabs>
+        <w:ind w:left="3949" w:hanging="360"/>
+      </w:pPr>
+      <w:rPr>
+        <w:rFonts w:ascii="Wingdings" w:hAnsi="Wingdings" w:hint="default"/>
+        <w:sz w:val="20"/>
+      </w:rPr>
+    </w:lvl>
+    <w:lvl w:ilvl="5" w:tentative="1">
+      <w:start w:val="1"/>
+      <w:numFmt w:val="bullet"/>
+      <w:lvlText w:val=""/>
+      <w:lvlJc w:val="left"/>
+      <w:pPr>
+        <w:tabs>
+          <w:tab w:val="num" w:pos="4669"/>
+        </w:tabs>
+        <w:ind w:left="4669" w:hanging="360"/>
+      </w:pPr>
+      <w:rPr>
+        <w:rFonts w:ascii="Wingdings" w:hAnsi="Wingdings" w:hint="default"/>
+        <w:sz w:val="20"/>
+      </w:rPr>
+    </w:lvl>
+    <w:lvl w:ilvl="6" w:tentative="1">
+      <w:start w:val="1"/>
+      <w:numFmt w:val="bullet"/>
+      <w:lvlText w:val=""/>
+      <w:lvlJc w:val="left"/>
+      <w:pPr>
+        <w:tabs>
+          <w:tab w:val="num" w:pos="5389"/>
+        </w:tabs>
+        <w:ind w:left="5389" w:hanging="360"/>
+      </w:pPr>
+      <w:rPr>
+        <w:rFonts w:ascii="Wingdings" w:hAnsi="Wingdings" w:hint="default"/>
+        <w:sz w:val="20"/>
+      </w:rPr>
+    </w:lvl>
+    <w:lvl w:ilvl="7" w:tentative="1">
+      <w:start w:val="1"/>
+      <w:numFmt w:val="bullet"/>
+      <w:lvlText w:val=""/>
+      <w:lvlJc w:val="left"/>
+      <w:pPr>
+        <w:tabs>
+          <w:tab w:val="num" w:pos="6109"/>
+        </w:tabs>
+        <w:ind w:left="6109" w:hanging="360"/>
+      </w:pPr>
+      <w:rPr>
+        <w:rFonts w:ascii="Wingdings" w:hAnsi="Wingdings" w:hint="default"/>
+        <w:sz w:val="20"/>
+      </w:rPr>
+    </w:lvl>
+    <w:lvl w:ilvl="8" w:tentative="1">
+      <w:start w:val="1"/>
+      <w:numFmt w:val="bullet"/>
+      <w:lvlText w:val=""/>
+      <w:lvlJc w:val="left"/>
+      <w:pPr>
+        <w:tabs>
+          <w:tab w:val="num" w:pos="6829"/>
+        </w:tabs>
+        <w:ind w:left="6829" w:hanging="360"/>
+      </w:pPr>
+      <w:rPr>
+        <w:rFonts w:ascii="Wingdings" w:hAnsi="Wingdings" w:hint="default"/>
+        <w:sz w:val="20"/>
+      </w:rPr>
+    </w:lvl>
+  </w:abstractNum>
   <w:num w:numId="1" w16cid:durableId="1921255642">
-    <w:abstractNumId w:val="2"/>
+    <w:abstractNumId w:val="4"/>
   </w:num>
   <w:num w:numId="2" w16cid:durableId="1798254855">
-    <w:abstractNumId w:val="5"/>
+    <w:abstractNumId w:val="7"/>
   </w:num>
   <w:num w:numId="3" w16cid:durableId="442460530">
-    <w:abstractNumId w:val="6"/>
+    <w:abstractNumId w:val="9"/>
   </w:num>
   <w:num w:numId="4" w16cid:durableId="143352866">
     <w:abstractNumId w:val="0"/>
   </w:num>
   <w:num w:numId="5" w16cid:durableId="1652832224">
-    <w:abstractNumId w:val="4"/>
+    <w:abstractNumId w:val="6"/>
   </w:num>
   <w:num w:numId="6" w16cid:durableId="270170836">
+    <w:abstractNumId w:val="5"/>
+  </w:num>
+  <w:num w:numId="7" w16cid:durableId="1417092954">
+    <w:abstractNumId w:val="2"/>
+  </w:num>
+  <w:num w:numId="8" w16cid:durableId="1867133328">
     <w:abstractNumId w:val="3"/>
   </w:num>
-  <w:num w:numId="7" w16cid:durableId="1417092954">
+  <w:num w:numId="9" w16cid:durableId="1163007191">
     <w:abstractNumId w:val="1"/>
+  </w:num>
+  <w:num w:numId="10" w16cid:durableId="2034064891">
+    <w:abstractNumId w:val="10"/>
+  </w:num>
+  <w:num w:numId="11" w16cid:durableId="153961911">
+    <w:abstractNumId w:val="8"/>
   </w:num>
 </w:numbering>
 </file>

</xml_diff>